<commit_message>
Remove unused UI components and update doc gen
Delete unused UI pieces (FAQWidget, NavLink, ScrollFeatures) and a placeholder SVG; remove temporary docx file. Update README to reflect removed FAQWidget. Add Cypress-LocalLink-Codebase.docx to .gitignore. Modify scripts/generate_codebase_docx.py to stop including removed components, switch rubric highlight to gray for B&W printing, add a diamond (◆) rubric indicator and helper function, and add a legend paragraph in the generated document. Also update the binary Cypress-LocalLink-Codebase.docx.
</commit_message>
<xml_diff>
--- a/Cypress-LocalLink-Codebase.docx
+++ b/Cypress-LocalLink-Codebase.docx
@@ -80,6 +80,16 @@
     </w:p>
     <w:p/>
     <w:p>
+      <w:r>
+        <w:rPr>
+          <w:b/>
+          <w:sz w:val="20"/>
+        </w:rPr>
+        <w:t>◆ = Rubric-relevant code (gray shading marks criteria)</w:t>
+      </w:r>
+    </w:p>
+    <w:p/>
+    <w:p>
       <w:pPr>
         <w:pStyle w:val="Heading1"/>
       </w:pPr>
@@ -184,7 +194,7 @@
         <w:pStyle w:val="Heading2"/>
       </w:pPr>
       <w:r>
-        <w:t>src/App.tsx</w:t>
+        <w:t>◆  src/App.tsx</w:t>
       </w:r>
     </w:p>
     <w:p>
@@ -197,7 +207,7 @@
           <w:rFonts w:ascii="Calibri" w:hAnsi="Calibri"/>
           <w:b/>
           <w:sz w:val="20"/>
-          <w:highlight w:val="yellow"/>
+          <w:highlight w:val="darkGray"/>
         </w:rPr>
         <w:t>FBLA Rubric: Logical program sequence; Program structure; Navigation (routing).</w:t>
       </w:r>
@@ -2163,7 +2173,7 @@
         <w:pStyle w:val="Heading2"/>
       </w:pPr>
       <w:r>
-        <w:t>src/components/Layout.tsx</w:t>
+        <w:t>◆  src/components/Layout.tsx</w:t>
       </w:r>
     </w:p>
     <w:p>
@@ -2176,7 +2186,7 @@
           <w:rFonts w:ascii="Calibri" w:hAnsi="Calibri"/>
           <w:b/>
           <w:sz w:val="20"/>
-          <w:highlight w:val="yellow"/>
+          <w:highlight w:val="darkGray"/>
         </w:rPr>
         <w:t>FBLA Rubric: Logical program sequence; Conciseness; Navigation structure.</w:t>
       </w:r>
@@ -2902,7 +2912,7 @@
         <w:pStyle w:val="Heading2"/>
       </w:pPr>
       <w:r>
-        <w:t>src/components/Navbar.tsx</w:t>
+        <w:t>◆  src/components/Navbar.tsx</w:t>
       </w:r>
     </w:p>
     <w:p>
@@ -2915,7 +2925,7 @@
           <w:rFonts w:ascii="Calibri" w:hAnsi="Calibri"/>
           <w:b/>
           <w:sz w:val="20"/>
-          <w:highlight w:val="yellow"/>
+          <w:highlight w:val="darkGray"/>
         </w:rPr>
         <w:t>FBLA Rubric: Usability &amp; navigation; Program usability features.</w:t>
       </w:r>
@@ -3298,7 +3308,7 @@
         <w:pStyle w:val="Heading2"/>
       </w:pPr>
       <w:r>
-        <w:t>src/components/ReCaptcha.tsx</w:t>
+        <w:t>◆  src/components/ReCaptcha.tsx</w:t>
       </w:r>
     </w:p>
     <w:p>
@@ -3311,7 +3321,7 @@
           <w:rFonts w:ascii="Calibri" w:hAnsi="Calibri"/>
           <w:b/>
           <w:sz w:val="20"/>
-          <w:highlight w:val="yellow"/>
+          <w:highlight w:val="darkGray"/>
         </w:rPr>
         <w:t>FBLA Rubric: Prompt — Verification to prevent bots; Program structure.</w:t>
       </w:r>
@@ -4028,7 +4038,7 @@
         <w:pStyle w:val="Heading2"/>
       </w:pPr>
       <w:r>
-        <w:t>src/data/businessData.ts</w:t>
+        <w:t>◆  src/data/businessData.ts</w:t>
       </w:r>
     </w:p>
     <w:p>
@@ -4041,7 +4051,7 @@
           <w:rFonts w:ascii="Calibri" w:hAnsi="Calibri"/>
           <w:b/>
           <w:sz w:val="20"/>
-          <w:highlight w:val="yellow"/>
+          <w:highlight w:val="darkGray"/>
         </w:rPr>
         <w:t>FBLA Rubric: Program Readability — Identifiers &amp; documentation (JSDoc); Data storage interfaces (Business, Review, Event, Deal); Program documentation completeness.</w:t>
       </w:r>
@@ -4486,7 +4496,7 @@
         <w:pStyle w:val="Heading2"/>
       </w:pPr>
       <w:r>
-        <w:t>src/hooks/AuthContext.tsx</w:t>
+        <w:t>◆  src/hooks/AuthContext.tsx</w:t>
       </w:r>
     </w:p>
     <w:p>
@@ -4499,7 +4509,7 @@
           <w:rFonts w:ascii="Calibri" w:hAnsi="Calibri"/>
           <w:b/>
           <w:sz w:val="20"/>
-          <w:highlight w:val="yellow"/>
+          <w:highlight w:val="darkGray"/>
         </w:rPr>
         <w:t>FBLA Rubric: Program structure; Conciseness; Modularity.</w:t>
       </w:r>
@@ -4915,7 +4925,7 @@
         <w:pStyle w:val="Heading2"/>
       </w:pPr>
       <w:r>
-        <w:t>src/hooks/useAuth.ts</w:t>
+        <w:t>◆  src/hooks/useAuth.ts</w:t>
       </w:r>
     </w:p>
     <w:p>
@@ -4928,7 +4938,7 @@
           <w:rFonts w:ascii="Calibri" w:hAnsi="Calibri"/>
           <w:b/>
           <w:sz w:val="20"/>
-          <w:highlight w:val="yellow"/>
+          <w:highlight w:val="darkGray"/>
         </w:rPr>
         <w:t>FBLA Rubric: Data storage; Program structure; Usability &amp; results.</w:t>
       </w:r>
@@ -5070,7 +5080,7 @@
         <w:pStyle w:val="Heading2"/>
       </w:pPr>
       <w:r>
-        <w:t>src/hooks/useFavorites.ts</w:t>
+        <w:t>◆  src/hooks/useFavorites.ts</w:t>
       </w:r>
     </w:p>
     <w:p>
@@ -5083,7 +5093,7 @@
           <w:rFonts w:ascii="Calibri" w:hAnsi="Calibri"/>
           <w:b/>
           <w:sz w:val="20"/>
-          <w:highlight w:val="yellow"/>
+          <w:highlight w:val="darkGray"/>
         </w:rPr>
         <w:t>FBLA Rubric: Prompt — Saving/bookmarking favorites; Data storage (localStorage per user); Program structure.</w:t>
       </w:r>
@@ -5212,7 +5222,7 @@
         <w:pStyle w:val="Heading2"/>
       </w:pPr>
       <w:r>
-        <w:t>src/hooks/useUserReviews.ts</w:t>
+        <w:t>◆  src/hooks/useUserReviews.ts</w:t>
       </w:r>
     </w:p>
     <w:p>
@@ -5225,7 +5235,7 @@
           <w:rFonts w:ascii="Calibri" w:hAnsi="Calibri"/>
           <w:b/>
           <w:sz w:val="20"/>
-          <w:highlight w:val="yellow"/>
+          <w:highlight w:val="darkGray"/>
         </w:rPr>
         <w:t>FBLA Rubric: Prompt — Users leave reviews/ratings; Data storage (localStorage); Dynamic updating of reviews.</w:t>
       </w:r>
@@ -5683,7 +5693,7 @@
         <w:pStyle w:val="Heading2"/>
       </w:pPr>
       <w:r>
-        <w:t>src/lib/authApi.ts</w:t>
+        <w:t>◆  src/lib/authApi.ts</w:t>
       </w:r>
     </w:p>
     <w:p>
@@ -5696,7 +5706,7 @@
           <w:rFonts w:ascii="Calibri" w:hAnsi="Calibri"/>
           <w:b/>
           <w:sz w:val="20"/>
-          <w:highlight w:val="yellow"/>
+          <w:highlight w:val="darkGray"/>
         </w:rPr>
         <w:t>FBLA Rubric: Data storage with security — localStorage-based auth; Appropriate data storage; Logical program sequence.</w:t>
       </w:r>
@@ -6390,7 +6400,7 @@
         <w:pStyle w:val="Heading2"/>
       </w:pPr>
       <w:r>
-        <w:t>src/pages/BusinessDetail.tsx</w:t>
+        <w:t>◆  src/pages/BusinessDetail.tsx</w:t>
       </w:r>
     </w:p>
     <w:p>
@@ -6403,7 +6413,7 @@
           <w:rFonts w:ascii="Calibri" w:hAnsi="Calibri"/>
           <w:b/>
           <w:sz w:val="20"/>
-          <w:highlight w:val="yellow"/>
+          <w:highlight w:val="darkGray"/>
         </w:rPr>
         <w:t>FBLA Rubric: Prompt — Users leave reviews; Sort by reviews/ratings display; Usability; Output reports.</w:t>
       </w:r>
@@ -7120,7 +7130,7 @@
         <w:pStyle w:val="Heading2"/>
       </w:pPr>
       <w:r>
-        <w:t>src/pages/BusinessLogin.tsx</w:t>
+        <w:t>◆  src/pages/BusinessLogin.tsx</w:t>
       </w:r>
     </w:p>
     <w:p>
@@ -7133,7 +7143,7 @@
           <w:rFonts w:ascii="Calibri" w:hAnsi="Calibri"/>
           <w:b/>
           <w:sz w:val="20"/>
-          <w:highlight w:val="yellow"/>
+          <w:highlight w:val="darkGray"/>
         </w:rPr>
         <w:t>FBLA Rubric: Bot verification (CAPTCHA); Usability; Navigation.</w:t>
       </w:r>
@@ -7463,7 +7473,7 @@
         <w:pStyle w:val="Heading2"/>
       </w:pPr>
       <w:r>
-        <w:t>src/pages/Directory.tsx</w:t>
+        <w:t>◆  src/pages/Directory.tsx</w:t>
       </w:r>
     </w:p>
     <w:p>
@@ -7476,7 +7486,7 @@
           <w:rFonts w:ascii="Calibri" w:hAnsi="Calibri"/>
           <w:b/>
           <w:sz w:val="20"/>
-          <w:highlight w:val="yellow"/>
+          <w:highlight w:val="darkGray"/>
         </w:rPr>
         <w:t>FBLA Rubric: Prompt — Sort by category, reviews, ratings; Usability &amp; navigation; Logical program sequence; Dynamic filtering.</w:t>
       </w:r>
@@ -8410,7 +8420,7 @@
         <w:pStyle w:val="Heading2"/>
       </w:pPr>
       <w:r>
-        <w:t>src/pages/Index.tsx</w:t>
+        <w:t>◆  src/pages/Index.tsx</w:t>
       </w:r>
     </w:p>
     <w:p>
@@ -8423,7 +8433,7 @@
           <w:rFonts w:ascii="Calibri" w:hAnsi="Calibri"/>
           <w:b/>
           <w:sz w:val="20"/>
-          <w:highlight w:val="yellow"/>
+          <w:highlight w:val="darkGray"/>
         </w:rPr>
         <w:t>FBLA Rubric: Prompt — Display deals/coupons; Usability; Navigation; Output reports quality.</w:t>
       </w:r>
@@ -9985,7 +9995,7 @@
         <w:pStyle w:val="Heading2"/>
       </w:pPr>
       <w:r>
-        <w:t>src/pages/MyFavorites.tsx</w:t>
+        <w:t>◆  src/pages/MyFavorites.tsx</w:t>
       </w:r>
     </w:p>
     <w:p>
@@ -9998,7 +10008,7 @@
           <w:rFonts w:ascii="Calibri" w:hAnsi="Calibri"/>
           <w:b/>
           <w:sz w:val="20"/>
-          <w:highlight w:val="yellow"/>
+          <w:highlight w:val="darkGray"/>
         </w:rPr>
         <w:t>FBLA Rubric: Prompt — Saving/bookmarking favorites; Usability; Results accuracy and dynamic updating.</w:t>
       </w:r>
@@ -10365,7 +10375,7 @@
         <w:pStyle w:val="Heading2"/>
       </w:pPr>
       <w:r>
-        <w:t>src/pages/SubmitBusiness.tsx</w:t>
+        <w:t>◆  src/pages/SubmitBusiness.tsx</w:t>
       </w:r>
     </w:p>
     <w:p>
@@ -10378,7 +10388,7 @@
           <w:rFonts w:ascii="Calibri" w:hAnsi="Calibri"/>
           <w:b/>
           <w:sz w:val="20"/>
-          <w:highlight w:val="yellow"/>
+          <w:highlight w:val="darkGray"/>
         </w:rPr>
         <w:t>FBLA Rubric: Input validation (Zod schema); Bot verification (CAPTCHA); Commentary quality; Form handling.</w:t>
       </w:r>

</xml_diff>

<commit_message>
Add SQL examples, refactor Events UI & navbar
Update generate_codebase_docx.py to remove some include patterns and rubric highlights and add an "Example SQL Tables" section (adds SQL table DDL code block). Modify Layout to use location.pathname as PageTransition key. Change Navbar logo Link to a plain anchor (<a href="/">) to avoid a white-screen client-side navigation issue. Major refactor of src/pages/Events.tsx: add Event type usage, implement getEventsForDate and DayContent for calendar cells, default to calendar view with a ToggleGroup control, add sorted list rendering, simplify calendar cell rendering via components, and remove the previous selectedDate/staggered list/EventCard flows. Binary Cypress-LocalLink-Codebase.docx updated to reflect generated docx changes.
</commit_message>
<xml_diff>
--- a/Cypress-LocalLink-Codebase.docx
+++ b/Cypress-LocalLink-Codebase.docx
@@ -94,6 +94,100 @@
         <w:pStyle w:val="Heading1"/>
       </w:pPr>
       <w:r>
+        <w:t>Example SQL Tables</w:t>
+      </w:r>
+    </w:p>
+    <w:p>
+      <w:r>
+        <w:t>The app uses static data and localStorage. Below are example SQL table definitions that could support a backend implementation.</w:t>
+      </w:r>
+    </w:p>
+    <w:p/>
+    <w:p>
+      <w:pPr>
+        <w:spacing w:before="120" w:after="120"/>
+        <w:ind w:left="288"/>
+      </w:pPr>
+      <w:r>
+        <w:rPr>
+          <w:rFonts w:ascii="Consolas" w:hAnsi="Consolas"/>
+          <w:sz w:val="18"/>
+        </w:rPr>
+        <w:t>-- Example: businesses table (could support the directory)</w:t>
+        <w:br/>
+        <w:t>CREATE TABLE businesses (</w:t>
+        <w:br/>
+        <w:t xml:space="preserve">  id          VARCHAR(50) PRIMARY KEY,</w:t>
+        <w:br/>
+        <w:t xml:space="preserve">  name        VARCHAR(100) NOT NULL,</w:t>
+        <w:br/>
+        <w:t xml:space="preserve">  category    VARCHAR(50) NOT NULL,</w:t>
+        <w:br/>
+        <w:t xml:space="preserve">  rating      DECIMAL(2,1) DEFAULT 0,</w:t>
+        <w:br/>
+        <w:t xml:space="preserve">  review_count INT DEFAULT 0,</w:t>
+        <w:br/>
+        <w:t xml:space="preserve">  address     VARCHAR(200) NOT NULL,</w:t>
+        <w:br/>
+        <w:t xml:space="preserve">  description TEXT,</w:t>
+        <w:br/>
+        <w:t xml:space="preserve">  image       VARCHAR(500),</w:t>
+        <w:br/>
+        <w:t xml:space="preserve">  price_range VARCHAR(10),</w:t>
+        <w:br/>
+        <w:t xml:space="preserve">  lat         DECIMAL(10,7),</w:t>
+        <w:br/>
+        <w:t xml:space="preserve">  lng         DECIMAL(10,7),</w:t>
+        <w:br/>
+        <w:t xml:space="preserve">  created_at  TIMESTAMP DEFAULT CURRENT_TIMESTAMP</w:t>
+        <w:br/>
+        <w:t>);</w:t>
+        <w:br/>
+        <w:br/>
+        <w:t>-- Example: user_reviews table (matches useUserReviews localStorage)</w:t>
+        <w:br/>
+        <w:t>CREATE TABLE user_reviews (</w:t>
+        <w:br/>
+        <w:t xml:space="preserve">  id          VARCHAR(50) PRIMARY KEY,</w:t>
+        <w:br/>
+        <w:t xml:space="preserve">  business_id VARCHAR(50) REFERENCES businesses(id),</w:t>
+        <w:br/>
+        <w:t xml:space="preserve">  user_id     VARCHAR(50) NOT NULL,</w:t>
+        <w:br/>
+        <w:t xml:space="preserve">  author      VARCHAR(100) NOT NULL,</w:t>
+        <w:br/>
+        <w:t xml:space="preserve">  rating      INT CHECK (rating &gt;= 1 AND rating &lt;= 5),</w:t>
+        <w:br/>
+        <w:t xml:space="preserve">  text        TEXT NOT NULL,</w:t>
+        <w:br/>
+        <w:t xml:space="preserve">  created_at  TIMESTAMP DEFAULT CURRENT_TIMESTAMP</w:t>
+        <w:br/>
+        <w:t>);</w:t>
+        <w:br/>
+        <w:br/>
+        <w:t>-- Example: favorites table (matches useFavorites localStorage)</w:t>
+        <w:br/>
+        <w:t>CREATE TABLE favorites (</w:t>
+        <w:br/>
+        <w:t xml:space="preserve">  user_id     VARCHAR(50) NOT NULL,</w:t>
+        <w:br/>
+        <w:t xml:space="preserve">  business_id VARCHAR(50) REFERENCES businesses(id),</w:t>
+        <w:br/>
+        <w:t xml:space="preserve">  PRIMARY KEY (user_id, business_id)</w:t>
+        <w:br/>
+        <w:t>);</w:t>
+      </w:r>
+    </w:p>
+    <w:p>
+      <w:r>
+        <w:br w:type="page"/>
+      </w:r>
+    </w:p>
+    <w:p>
+      <w:pPr>
+        <w:pStyle w:val="Heading1"/>
+      </w:pPr>
+      <w:r>
         <w:t>Table of Contents</w:t>
       </w:r>
     </w:p>
@@ -128,201 +222,6 @@
         <w:pStyle w:val="Heading2"/>
       </w:pPr>
       <w:r>
-        <w:t>index.html</w:t>
-      </w:r>
-    </w:p>
-    <w:p>
-      <w:pPr>
-        <w:spacing w:before="120" w:after="120"/>
-        <w:ind w:left="288"/>
-      </w:pPr>
-      <w:r>
-        <w:rPr>
-          <w:rFonts w:ascii="Consolas" w:hAnsi="Consolas"/>
-          <w:sz w:val="18"/>
-        </w:rPr>
-        <w:t>&lt;!doctype html&gt;</w:t>
-        <w:br/>
-        <w:t>&lt;html lang="en"&gt;</w:t>
-        <w:br/>
-        <w:t xml:space="preserve">  &lt;head&gt;</w:t>
-        <w:br/>
-        <w:t xml:space="preserve">    &lt;meta charset="UTF-8" /&gt;</w:t>
-        <w:br/>
-        <w:t xml:space="preserve">    &lt;link rel="icon" type="image/svg+xml" href="/favicon.svg" /&gt;</w:t>
-        <w:br/>
-        <w:t xml:space="preserve">    &lt;meta name="viewport" content="width=device-width, initial-scale=1.0" /&gt;</w:t>
-        <w:br/>
-        <w:t xml:space="preserve">    &lt;title&gt;Cypress LocalLink&lt;/title&gt;</w:t>
-        <w:br/>
-        <w:t xml:space="preserve">    &lt;meta name="description" content="Local business directory for Cypress, Texas. Find businesses, events, deals, and more."&gt;</w:t>
-        <w:br/>
-        <w:t xml:space="preserve">    &lt;meta name="author" content="Cypress LocalLink" /&gt;</w:t>
-        <w:br/>
-        <w:br/>
-        <w:t xml:space="preserve">    &lt;meta property="og:type" content="website" /&gt;</w:t>
-        <w:br/>
-        <w:t xml:space="preserve">    &lt;meta property="og:title" content="Cypress LocalLink" /&gt;</w:t>
-        <w:br/>
-        <w:t xml:space="preserve">    &lt;meta property="og:description" content="Local business directory for Cypress, Texas. Find businesses, events, deals, and more." /&gt;</w:t>
-        <w:br/>
-        <w:br/>
-        <w:t xml:space="preserve">    &lt;meta name="twitter:card" content="summary_large_image" /&gt;</w:t>
-        <w:br/>
-        <w:t xml:space="preserve">    &lt;meta name="twitter:title" content="Cypress LocalLink" /&gt;</w:t>
-        <w:br/>
-        <w:t xml:space="preserve">    &lt;meta name="twitter:description" content="Local business directory for Cypress, Texas. Find businesses, events, deals, and more." /&gt;</w:t>
-        <w:br/>
-        <w:t>&lt;/head&gt;</w:t>
-        <w:br/>
-        <w:br/>
-        <w:t xml:space="preserve">  &lt;body&gt;</w:t>
-        <w:br/>
-        <w:t xml:space="preserve">    &lt;div id="root"&gt;&lt;/div&gt;</w:t>
-        <w:br/>
-        <w:t xml:space="preserve">    &lt;script type="module" src="/src/main.tsx"&gt;&lt;/script&gt;</w:t>
-        <w:br/>
-        <w:t xml:space="preserve">  &lt;/body&gt;</w:t>
-        <w:br/>
-        <w:t>&lt;/html&gt;</w:t>
-        <w:br/>
-      </w:r>
-    </w:p>
-    <w:p/>
-    <w:p>
-      <w:pPr>
-        <w:pStyle w:val="Heading2"/>
-      </w:pPr>
-      <w:r>
-        <w:t>◆  src/App.tsx</w:t>
-      </w:r>
-    </w:p>
-    <w:p>
-      <w:pPr>
-        <w:spacing w:before="160" w:after="120"/>
-        <w:ind w:left="216" w:right="216"/>
-      </w:pPr>
-      <w:r>
-        <w:rPr>
-          <w:rFonts w:ascii="Calibri" w:hAnsi="Calibri"/>
-          <w:b/>
-          <w:sz w:val="20"/>
-          <w:highlight w:val="darkGray"/>
-        </w:rPr>
-        <w:t>FBLA Rubric: Logical program sequence; Program structure; Navigation (routing).</w:t>
-      </w:r>
-    </w:p>
-    <w:p>
-      <w:pPr>
-        <w:spacing w:before="120" w:after="120"/>
-        <w:ind w:left="288"/>
-      </w:pPr>
-      <w:r>
-        <w:rPr>
-          <w:rFonts w:ascii="Consolas" w:hAnsi="Consolas"/>
-          <w:sz w:val="18"/>
-        </w:rPr>
-        <w:t>import { Toaster } from "@/components/ui/toaster";</w:t>
-        <w:br/>
-        <w:t>import { Toaster as Sonner } from "@/components/ui/sonner";</w:t>
-        <w:br/>
-        <w:t>import { TooltipProvider } from "@/components/ui/tooltip";</w:t>
-        <w:br/>
-        <w:t>import { QueryClient, QueryClientProvider } from "@tanstack/react-query";</w:t>
-        <w:br/>
-        <w:t>import { BrowserRouter, Routes, Route } from "react-router-dom";</w:t>
-        <w:br/>
-        <w:t>import { AuthProvider } from "@/hooks/AuthContext";</w:t>
-        <w:br/>
-        <w:t>import Layout from "./components/Layout";</w:t>
-        <w:br/>
-        <w:t>import Index from "./pages/Index";</w:t>
-        <w:br/>
-        <w:t>import Directory from "./pages/Directory";</w:t>
-        <w:br/>
-        <w:t>import MapPage from "./pages/MapPage";</w:t>
-        <w:br/>
-        <w:t>import About from "./pages/About";</w:t>
-        <w:br/>
-        <w:t>import Events from "./pages/Events";</w:t>
-        <w:br/>
-        <w:t>import SubmitBusiness from "./pages/SubmitBusiness";</w:t>
-        <w:br/>
-        <w:t>import BusinessDetail from "./pages/BusinessDetail";</w:t>
-        <w:br/>
-        <w:t>import BusinessLogin from "./pages/BusinessLogin";</w:t>
-        <w:br/>
-        <w:t>import MyFavorites from "./pages/MyFavorites";</w:t>
-        <w:br/>
-        <w:t>import NotFound from "./pages/NotFound";</w:t>
-        <w:br/>
-        <w:br/>
-        <w:t>const queryClient = new QueryClient();</w:t>
-        <w:br/>
-        <w:br/>
-        <w:t>const App = () =&gt; (</w:t>
-        <w:br/>
-        <w:t xml:space="preserve">  &lt;QueryClientProvider client={queryClient}&gt;</w:t>
-        <w:br/>
-        <w:t xml:space="preserve">    &lt;AuthProvider&gt;</w:t>
-        <w:br/>
-        <w:t xml:space="preserve">    &lt;TooltipProvider&gt;</w:t>
-        <w:br/>
-        <w:t xml:space="preserve">      &lt;Toaster /&gt;</w:t>
-        <w:br/>
-        <w:t xml:space="preserve">      &lt;Sonner /&gt;</w:t>
-        <w:br/>
-        <w:t xml:space="preserve">      &lt;BrowserRouter&gt;</w:t>
-        <w:br/>
-        <w:t xml:space="preserve">        &lt;Routes&gt;</w:t>
-        <w:br/>
-        <w:t xml:space="preserve">          &lt;Route element={&lt;Layout /&gt;}&gt;</w:t>
-        <w:br/>
-        <w:t xml:space="preserve">            &lt;Route path="/" element={&lt;Index /&gt;} /&gt;</w:t>
-        <w:br/>
-        <w:t xml:space="preserve">            &lt;Route path="/directory" element={&lt;Directory /&gt;} /&gt;</w:t>
-        <w:br/>
-        <w:t xml:space="preserve">            &lt;Route path="/map" element={&lt;MapPage /&gt;} /&gt;</w:t>
-        <w:br/>
-        <w:t xml:space="preserve">            &lt;Route path="/about" element={&lt;About /&gt;} /&gt;</w:t>
-        <w:br/>
-        <w:t xml:space="preserve">            &lt;Route path="/events" element={&lt;Events /&gt;} /&gt;</w:t>
-        <w:br/>
-        <w:t xml:space="preserve">            &lt;Route path="/submit" element={&lt;SubmitBusiness /&gt;} /&gt;</w:t>
-        <w:br/>
-        <w:t xml:space="preserve">            &lt;Route path="/business/:id" element={&lt;BusinessDetail /&gt;} /&gt;</w:t>
-        <w:br/>
-        <w:t xml:space="preserve">            &lt;Route path="/favorites" element={&lt;MyFavorites /&gt;} /&gt;</w:t>
-        <w:br/>
-        <w:t xml:space="preserve">            &lt;Route path="/login" element={&lt;BusinessLogin /&gt;} /&gt;</w:t>
-        <w:br/>
-        <w:t xml:space="preserve">          &lt;/Route&gt;</w:t>
-        <w:br/>
-        <w:t xml:space="preserve">          &lt;Route path="*" element={&lt;NotFound /&gt;} /&gt;</w:t>
-        <w:br/>
-        <w:t xml:space="preserve">        &lt;/Routes&gt;</w:t>
-        <w:br/>
-        <w:t xml:space="preserve">      &lt;/BrowserRouter&gt;</w:t>
-        <w:br/>
-        <w:t xml:space="preserve">    &lt;/TooltipProvider&gt;</w:t>
-        <w:br/>
-        <w:t xml:space="preserve">    &lt;/AuthProvider&gt;</w:t>
-        <w:br/>
-        <w:t xml:space="preserve">  &lt;/QueryClientProvider&gt;</w:t>
-        <w:br/>
-        <w:t>);</w:t>
-        <w:br/>
-        <w:br/>
-        <w:t>export default App;</w:t>
-        <w:br/>
-      </w:r>
-    </w:p>
-    <w:p/>
-    <w:p>
-      <w:pPr>
-        <w:pStyle w:val="Heading2"/>
-      </w:pPr>
-      <w:r>
         <w:t>src/components/ChatWidget.tsx</w:t>
       </w:r>
     </w:p>
@@ -1021,349 +920,6 @@
         <w:br/>
         <w:br/>
         <w:t>export default ChatWidget;</w:t>
-        <w:br/>
-      </w:r>
-    </w:p>
-    <w:p/>
-    <w:p>
-      <w:pPr>
-        <w:pStyle w:val="Heading2"/>
-      </w:pPr>
-      <w:r>
-        <w:t>src/components/FAQWidget.tsx</w:t>
-      </w:r>
-    </w:p>
-    <w:p>
-      <w:pPr>
-        <w:spacing w:before="120" w:after="120"/>
-        <w:ind w:left="288"/>
-      </w:pPr>
-      <w:r>
-        <w:rPr>
-          <w:rFonts w:ascii="Consolas" w:hAnsi="Consolas"/>
-          <w:sz w:val="18"/>
-        </w:rPr>
-        <w:t>import { useState } from 'react';</w:t>
-        <w:br/>
-        <w:t>import { motion, AnimatePresence } from 'framer-motion';</w:t>
-        <w:br/>
-        <w:t>import { cn } from '@/lib/utils';</w:t>
-        <w:br/>
-        <w:br/>
-        <w:t>interface FAQItem {</w:t>
-        <w:br/>
-        <w:t xml:space="preserve">  question: string;</w:t>
-        <w:br/>
-        <w:t xml:space="preserve">  answer: string;</w:t>
-        <w:br/>
-        <w:t xml:space="preserve">  category: string;</w:t>
-        <w:br/>
-        <w:t>}</w:t>
-        <w:br/>
-        <w:br/>
-        <w:t>const faqs: FAQItem[] = [</w:t>
-        <w:br/>
-        <w:t xml:space="preserve">  {</w:t>
-        <w:br/>
-        <w:t xml:space="preserve">    category: 'Getting Started',</w:t>
-        <w:br/>
-        <w:t xml:space="preserve">    question: 'What is Cypress LocalLink?',</w:t>
-        <w:br/>
-        <w:t xml:space="preserve">    answer: 'Cypress LocalLink is a community hub that connects Cypress, Texas residents with local businesses, events, and resources. Browse our directory, explore the map, and stay updated on community events.',</w:t>
-        <w:br/>
-        <w:t xml:space="preserve">  },</w:t>
-        <w:br/>
-        <w:t xml:space="preserve">  {</w:t>
-        <w:br/>
-        <w:t xml:space="preserve">    category: 'Getting Started',</w:t>
-        <w:br/>
-        <w:t xml:space="preserve">    question: 'How do I find a business?',</w:t>
-        <w:br/>
-        <w:t xml:space="preserve">    answer: 'Head to the Business Directory page where you can search by name, filter by category, and browse 92+ local businesses. Click any card to flip it and see more details, or tap "View Full Profile" for the complete listing.',</w:t>
-        <w:br/>
-        <w:t xml:space="preserve">  },</w:t>
-        <w:br/>
-        <w:t xml:space="preserve">  {</w:t>
-        <w:br/>
-        <w:t xml:space="preserve">    category: 'Getting Started',</w:t>
-        <w:br/>
-        <w:t xml:space="preserve">    question: 'How do I use the community map?',</w:t>
-        <w:br/>
-        <w:t xml:space="preserve">    answer: 'Visit the Map page to see all businesses plotted on an interactive map. Use the sidebar to search and filter, then click any business to center the map on its location. Click map pins for quick business details.',</w:t>
-        <w:br/>
-        <w:t xml:space="preserve">  },</w:t>
-        <w:br/>
-        <w:t xml:space="preserve">  {</w:t>
-        <w:br/>
-        <w:t xml:space="preserve">    category: 'For Business Owners',</w:t>
-        <w:br/>
-        <w:t xml:space="preserve">    question: 'How do I list my business?',</w:t>
-        <w:br/>
-        <w:t xml:space="preserve">    answer: 'Click "Submit" in the navigation bar to access the submission form. Fill in your business details including name, category, address, and description. Our team will review and approve your listing.',</w:t>
-        <w:br/>
-        <w:t xml:space="preserve">  },</w:t>
-        <w:br/>
-        <w:t xml:space="preserve">  {</w:t>
-        <w:br/>
-        <w:t xml:space="preserve">    category: 'For Business Owners',</w:t>
-        <w:br/>
-        <w:t xml:space="preserve">    question: 'How do I manage my listing?',</w:t>
-        <w:br/>
-        <w:t xml:space="preserve">    answer: 'Use the Business Portal by clicking "Login" in the top navigation. Once logged in, you can update your business information, hours, and other details. Business management features are coming soon!',</w:t>
-        <w:br/>
-        <w:t xml:space="preserve">  },</w:t>
-        <w:br/>
-        <w:t xml:space="preserve">  {</w:t>
-        <w:br/>
-        <w:t xml:space="preserve">    category: 'Events',</w:t>
-        <w:br/>
-        <w:t xml:space="preserve">    question: 'How do I find community events?',</w:t>
-        <w:br/>
-        <w:t xml:space="preserve">    answer: 'Visit the Events page to see all upcoming events. You can switch between a list view and a calendar view. Click on any date in the calendar to see events happening that day.',</w:t>
-        <w:br/>
-        <w:t xml:space="preserve">  },</w:t>
-        <w:br/>
-        <w:t xml:space="preserve">  {</w:t>
-        <w:br/>
-        <w:t xml:space="preserve">    category: 'Events',</w:t>
-        <w:br/>
-        <w:t xml:space="preserve">    question: 'Can I submit my own event?',</w:t>
-        <w:br/>
-        <w:t xml:space="preserve">    answer: 'Event submissions are coming soon! In the meantime, reach out to us through the contact information on the About page to have your community event featured.',</w:t>
-        <w:br/>
-        <w:t xml:space="preserve">  },</w:t>
-        <w:br/>
-        <w:t xml:space="preserve">  {</w:t>
-        <w:br/>
-        <w:t xml:space="preserve">    category: 'General',</w:t>
-        <w:br/>
-        <w:t xml:space="preserve">    question: 'Is Cypress LocalLink free to use?',</w:t>
-        <w:br/>
-        <w:t xml:space="preserve">    answer: 'Yes! Browsing the directory, using the map, and viewing events is completely free for all Cypress residents. Business listings are also free of charge.',</w:t>
-        <w:br/>
-        <w:t xml:space="preserve">  },</w:t>
-        <w:br/>
-        <w:t xml:space="preserve">  {</w:t>
-        <w:br/>
-        <w:t xml:space="preserve">    category: 'General',</w:t>
-        <w:br/>
-        <w:t xml:space="preserve">    question: 'How do I take the website tour?',</w:t>
-        <w:br/>
-        <w:t xml:space="preserve">    answer: 'Click the "?" help button in the bottom-right corner of the screen to launch an interactive guided tour that walks you through all the key features of the website.',</w:t>
-        <w:br/>
-        <w:t xml:space="preserve">  },</w:t>
-        <w:br/>
-        <w:t>];</w:t>
-        <w:br/>
-        <w:br/>
-        <w:t>const categories = [...new Set(faqs.map(f =&gt; f.category))];</w:t>
-        <w:br/>
-        <w:br/>
-        <w:t>export const FAQWidget = () =&gt; {</w:t>
-        <w:br/>
-        <w:t xml:space="preserve">  const [isOpen, setIsOpen] = useState(false);</w:t>
-        <w:br/>
-        <w:t xml:space="preserve">  const [openIndex, setOpenIndex] = useState&lt;number | null&gt;(null);</w:t>
-        <w:br/>
-        <w:t xml:space="preserve">  const [activeCategory, setActiveCategory] = useState(categories[0]);</w:t>
-        <w:br/>
-        <w:br/>
-        <w:t xml:space="preserve">  const filteredFaqs = faqs.filter(f =&gt; f.category === activeCategory);</w:t>
-        <w:br/>
-        <w:br/>
-        <w:t xml:space="preserve">  return (</w:t>
-        <w:br/>
-        <w:t xml:space="preserve">    &lt;&gt;</w:t>
-        <w:br/>
-        <w:t xml:space="preserve">      {/* Toggle Button */}</w:t>
-        <w:br/>
-        <w:t xml:space="preserve">      &lt;motion.button</w:t>
-        <w:br/>
-        <w:t xml:space="preserve">        initial={{ scale: 0 }}</w:t>
-        <w:br/>
-        <w:t xml:space="preserve">        animate={{ scale: 1 }}</w:t>
-        <w:br/>
-        <w:t xml:space="preserve">        transition={{ delay: 2.5, type: 'spring' }}</w:t>
-        <w:br/>
-        <w:t xml:space="preserve">        onClick={() =&gt; setIsOpen(!isOpen)}</w:t>
-        <w:br/>
-        <w:t xml:space="preserve">        className={cn(</w:t>
-        <w:br/>
-        <w:t xml:space="preserve">          'fixed bottom-6 right-24 z-[9998] w-14 h-14 rounded-2xl flex items-center justify-center depth-shadow-lg hover:scale-110 transition-transform',</w:t>
-        <w:br/>
-        <w:t xml:space="preserve">          isOpen ? 'bg-destructive text-destructive-foreground' : 'bg-gold text-primary'</w:t>
-        <w:br/>
-        <w:t xml:space="preserve">        )}</w:t>
-        <w:br/>
-        <w:t xml:space="preserve">        title="Frequently Asked Questions"</w:t>
-        <w:br/>
-        <w:t xml:space="preserve">      &gt;</w:t>
-        <w:br/>
-        <w:t xml:space="preserve">        {isOpen ? '×' : '?'}</w:t>
-        <w:br/>
-        <w:t xml:space="preserve">      &lt;/motion.button&gt;</w:t>
-        <w:br/>
-        <w:br/>
-        <w:t xml:space="preserve">      {/* Panel */}</w:t>
-        <w:br/>
-        <w:t xml:space="preserve">      &lt;AnimatePresence&gt;</w:t>
-        <w:br/>
-        <w:t xml:space="preserve">        {isOpen &amp;&amp; (</w:t>
-        <w:br/>
-        <w:t xml:space="preserve">          &lt;motion.div</w:t>
-        <w:br/>
-        <w:t xml:space="preserve">            initial={{ opacity: 0, y: 20, scale: 0.95 }}</w:t>
-        <w:br/>
-        <w:t xml:space="preserve">            animate={{ opacity: 1, y: 0, scale: 1 }}</w:t>
-        <w:br/>
-        <w:t xml:space="preserve">            exit={{ opacity: 0, y: 20, scale: 0.95 }}</w:t>
-        <w:br/>
-        <w:t xml:space="preserve">            transition={{ duration: 0.25 }}</w:t>
-        <w:br/>
-        <w:t xml:space="preserve">            className="fixed bottom-24 right-6 z-[9998] w-[380px] max-h-[70vh] bg-card border border-border rounded-2xl depth-shadow-lg flex flex-col overflow-hidden"</w:t>
-        <w:br/>
-        <w:t xml:space="preserve">          &gt;</w:t>
-        <w:br/>
-        <w:t xml:space="preserve">            {/* Header */}</w:t>
-        <w:br/>
-        <w:t xml:space="preserve">            &lt;div className="bg-navy-gradient p-5 flex-shrink-0"&gt;</w:t>
-        <w:br/>
-        <w:t xml:space="preserve">              &lt;h3 className="font-display text-lg font-bold text-primary-foreground"&gt;</w:t>
-        <w:br/>
-        <w:t xml:space="preserve">                Frequently Asked &lt;span className="text-gold"&gt;Questions&lt;/span&gt;</w:t>
-        <w:br/>
-        <w:t xml:space="preserve">              &lt;/h3&gt;</w:t>
-        <w:br/>
-        <w:t xml:space="preserve">              &lt;p className="text-primary-foreground/60 text-xs mt-1"&gt;Find answers to common questions&lt;/p&gt;</w:t>
-        <w:br/>
-        <w:t xml:space="preserve">            &lt;/div&gt;</w:t>
-        <w:br/>
-        <w:br/>
-        <w:t xml:space="preserve">            {/* Category Tabs */}</w:t>
-        <w:br/>
-        <w:t xml:space="preserve">            &lt;div className="flex gap-1 p-3 border-b border-border overflow-x-auto flex-shrink-0"&gt;</w:t>
-        <w:br/>
-        <w:t xml:space="preserve">              {categories.map((cat) =&gt; (</w:t>
-        <w:br/>
-        <w:t xml:space="preserve">                &lt;button</w:t>
-        <w:br/>
-        <w:t xml:space="preserve">                  key={cat}</w:t>
-        <w:br/>
-        <w:t xml:space="preserve">                  onClick={() =&gt; { setActiveCategory(cat); setOpenIndex(null); }}</w:t>
-        <w:br/>
-        <w:t xml:space="preserve">                  className={cn(</w:t>
-        <w:br/>
-        <w:t xml:space="preserve">                    'px-3 py-1.5 rounded-lg text-xs font-medium whitespace-nowrap transition-all',</w:t>
-        <w:br/>
-        <w:t xml:space="preserve">                    activeCategory === cat</w:t>
-        <w:br/>
-        <w:t xml:space="preserve">                      ? 'bg-primary text-primary-foreground'</w:t>
-        <w:br/>
-        <w:t xml:space="preserve">                      : 'text-muted-foreground hover:text-foreground hover:bg-muted'</w:t>
-        <w:br/>
-        <w:t xml:space="preserve">                  )}</w:t>
-        <w:br/>
-        <w:t xml:space="preserve">                &gt;</w:t>
-        <w:br/>
-        <w:t xml:space="preserve">                  {cat}</w:t>
-        <w:br/>
-        <w:t xml:space="preserve">                &lt;/button&gt;</w:t>
-        <w:br/>
-        <w:t xml:space="preserve">              ))}</w:t>
-        <w:br/>
-        <w:t xml:space="preserve">            &lt;/div&gt;</w:t>
-        <w:br/>
-        <w:br/>
-        <w:t xml:space="preserve">            {/* FAQ List */}</w:t>
-        <w:br/>
-        <w:t xml:space="preserve">            &lt;div className="flex-1 overflow-y-auto p-3 space-y-2"&gt;</w:t>
-        <w:br/>
-        <w:t xml:space="preserve">              {filteredFaqs.map((faq, i) =&gt; {</w:t>
-        <w:br/>
-        <w:t xml:space="preserve">                const globalIndex = faqs.indexOf(faq);</w:t>
-        <w:br/>
-        <w:t xml:space="preserve">                const isItemOpen = openIndex === globalIndex;</w:t>
-        <w:br/>
-        <w:t xml:space="preserve">                return (</w:t>
-        <w:br/>
-        <w:t xml:space="preserve">                  &lt;div key={globalIndex} className="rounded-xl border border-border overflow-hidden"&gt;</w:t>
-        <w:br/>
-        <w:t xml:space="preserve">                    &lt;button</w:t>
-        <w:br/>
-        <w:t xml:space="preserve">                      onClick={() =&gt; setOpenIndex(isItemOpen ? null : globalIndex)}</w:t>
-        <w:br/>
-        <w:t xml:space="preserve">                      className="w-full flex items-start gap-3 p-4 text-left hover:bg-muted/50 transition-colors"</w:t>
-        <w:br/>
-        <w:t xml:space="preserve">                    &gt;</w:t>
-        <w:br/>
-        <w:t xml:space="preserve">                      &lt;span className="flex-1 text-sm font-medium text-foreground leading-snug"&gt;{faq.question}&lt;/span&gt;</w:t>
-        <w:br/>
-        <w:t xml:space="preserve">                      &lt;motion.div</w:t>
-        <w:br/>
-        <w:t xml:space="preserve">                        animate={{ rotate: isItemOpen ? 180 : 0 }}</w:t>
-        <w:br/>
-        <w:t xml:space="preserve">                        transition={{ duration: 0.2 }}</w:t>
-        <w:br/>
-        <w:t xml:space="preserve">                        className="flex-shrink-0 mt-0.5"</w:t>
-        <w:br/>
-        <w:t xml:space="preserve">                      &gt;</w:t>
-        <w:br/>
-        <w:t xml:space="preserve">                        &lt;span className="text-muted-foreground"&gt;∨&lt;/span&gt;</w:t>
-        <w:br/>
-        <w:t xml:space="preserve">                      &lt;/motion.div&gt;</w:t>
-        <w:br/>
-        <w:t xml:space="preserve">                    &lt;/button&gt;</w:t>
-        <w:br/>
-        <w:t xml:space="preserve">                    &lt;AnimatePresence&gt;</w:t>
-        <w:br/>
-        <w:t xml:space="preserve">                      {isItemOpen &amp;&amp; (</w:t>
-        <w:br/>
-        <w:t xml:space="preserve">                        &lt;motion.div</w:t>
-        <w:br/>
-        <w:t xml:space="preserve">                          initial={{ height: 0, opacity: 0 }}</w:t>
-        <w:br/>
-        <w:t xml:space="preserve">                          animate={{ height: 'auto', opacity: 1 }}</w:t>
-        <w:br/>
-        <w:t xml:space="preserve">                          exit={{ height: 0, opacity: 0 }}</w:t>
-        <w:br/>
-        <w:t xml:space="preserve">                          transition={{ duration: 0.2 }}</w:t>
-        <w:br/>
-        <w:t xml:space="preserve">                        &gt;</w:t>
-        <w:br/>
-        <w:t xml:space="preserve">                          &lt;div className="px-4 pb-4 text-sm text-muted-foreground leading-relaxed border-t border-border pt-3"&gt;</w:t>
-        <w:br/>
-        <w:t xml:space="preserve">                            {faq.answer}</w:t>
-        <w:br/>
-        <w:t xml:space="preserve">                          &lt;/div&gt;</w:t>
-        <w:br/>
-        <w:t xml:space="preserve">                        &lt;/motion.div&gt;</w:t>
-        <w:br/>
-        <w:t xml:space="preserve">                      )}</w:t>
-        <w:br/>
-        <w:t xml:space="preserve">                    &lt;/AnimatePresence&gt;</w:t>
-        <w:br/>
-        <w:t xml:space="preserve">                  &lt;/div&gt;</w:t>
-        <w:br/>
-        <w:t xml:space="preserve">                );</w:t>
-        <w:br/>
-        <w:t xml:space="preserve">              })}</w:t>
-        <w:br/>
-        <w:t xml:space="preserve">            &lt;/div&gt;</w:t>
-        <w:br/>
-        <w:t xml:space="preserve">          &lt;/motion.div&gt;</w:t>
-        <w:br/>
-        <w:t xml:space="preserve">        )}</w:t>
-        <w:br/>
-        <w:t xml:space="preserve">      &lt;/AnimatePresence&gt;</w:t>
-        <w:br/>
-        <w:t xml:space="preserve">    &lt;/&gt;</w:t>
-        <w:br/>
-        <w:t xml:space="preserve">  );</w:t>
-        <w:br/>
-        <w:t>};</w:t>
-        <w:br/>
-        <w:br/>
-        <w:t>export default FAQWidget;</w:t>
         <w:br/>
       </w:r>
     </w:p>
@@ -3768,149 +3324,6 @@
         <w:pStyle w:val="Heading2"/>
       </w:pPr>
       <w:r>
-        <w:t>src/components/ScrollFeatures.tsx</w:t>
-      </w:r>
-    </w:p>
-    <w:p>
-      <w:pPr>
-        <w:spacing w:before="120" w:after="120"/>
-        <w:ind w:left="288"/>
-      </w:pPr>
-      <w:r>
-        <w:rPr>
-          <w:rFonts w:ascii="Consolas" w:hAnsi="Consolas"/>
-          <w:sz w:val="18"/>
-        </w:rPr>
-        <w:t>import { useRef } from 'react';</w:t>
-        <w:br/>
-        <w:t>import { motion, useScroll, useTransform } from 'framer-motion';</w:t>
-        <w:br/>
-        <w:br/>
-        <w:t>const features = [</w:t>
-        <w:br/>
-        <w:t xml:space="preserve">  {</w:t>
-        <w:br/>
-        <w:t xml:space="preserve">    label: 'FORM',</w:t>
-        <w:br/>
-        <w:t xml:space="preserve">    title: 'Fluid Geometry',</w:t>
-        <w:br/>
-        <w:t xml:space="preserve">    description: 'Every vertex shifts in real-time, driven by layered noise fields that create organic, never-repeating shapes.',</w:t>
-        <w:br/>
-        <w:t xml:space="preserve">  },</w:t>
-        <w:br/>
-        <w:t xml:space="preserve">  {</w:t>
-        <w:br/>
-        <w:t xml:space="preserve">    label: 'COLOR',</w:t>
-        <w:br/>
-        <w:t xml:space="preserve">    title: 'Living Gradient',</w:t>
-        <w:br/>
-        <w:t xml:space="preserve">    description: 'Colors flow across the surface using fresnel shading and time-based blending — cyan, violet, and magenta in constant flux.',</w:t>
-        <w:br/>
-        <w:t xml:space="preserve">  },</w:t>
-        <w:br/>
-        <w:t xml:space="preserve">  {</w:t>
-        <w:br/>
-        <w:t xml:space="preserve">    label: 'MOTION',</w:t>
-        <w:br/>
-        <w:t xml:space="preserve">    title: 'Infinite Evolution',</w:t>
-        <w:br/>
-        <w:t xml:space="preserve">    description: 'No keyframes. No loops. The morph is generative — always moving, always unique, always alive.',</w:t>
-        <w:br/>
-        <w:t xml:space="preserve">  },</w:t>
-        <w:br/>
-        <w:t>];</w:t>
-        <w:br/>
-        <w:br/>
-        <w:t>const FeatureCard = ({ feature, index }: { feature: typeof features[0]; index: number }) =&gt; {</w:t>
-        <w:br/>
-        <w:t xml:space="preserve">  const ref = useRef&lt;HTMLDivElement&gt;(null);</w:t>
-        <w:br/>
-        <w:t xml:space="preserve">  const { scrollYProgress } = useScroll({</w:t>
-        <w:br/>
-        <w:t xml:space="preserve">    target: ref,</w:t>
-        <w:br/>
-        <w:t xml:space="preserve">    offset: ['start end', 'end start'],</w:t>
-        <w:br/>
-        <w:t xml:space="preserve">  });</w:t>
-        <w:br/>
-        <w:br/>
-        <w:t xml:space="preserve">  const opacity = useTransform(scrollYProgress, [0, 0.3, 0.7, 1], [0, 1, 1, 0]);</w:t>
-        <w:br/>
-        <w:t xml:space="preserve">  const x = useTransform(</w:t>
-        <w:br/>
-        <w:t xml:space="preserve">    scrollYProgress,</w:t>
-        <w:br/>
-        <w:t xml:space="preserve">    [0, 0.3, 0.7, 1],</w:t>
-        <w:br/>
-        <w:t xml:space="preserve">    [index % 2 === 0 ? -100 : 100, 0, 0, index % 2 === 0 ? -100 : 100]</w:t>
-        <w:br/>
-        <w:t xml:space="preserve">  );</w:t>
-        <w:br/>
-        <w:br/>
-        <w:t xml:space="preserve">  return (</w:t>
-        <w:br/>
-        <w:t xml:space="preserve">    &lt;motion.div ref={ref} style={{ opacity, x }} className="py-32"&gt;</w:t>
-        <w:br/>
-        <w:t xml:space="preserve">      &lt;div className={`flex flex-col ${index % 2 === 0 ? 'items-start text-left' : 'items-end text-right'}`}&gt;</w:t>
-        <w:br/>
-        <w:t xml:space="preserve">        &lt;span className="font-mono text-xs tracking-[0.3em] text-primary text-glow mb-4"&gt;</w:t>
-        <w:br/>
-        <w:t xml:space="preserve">          {feature.label}</w:t>
-        <w:br/>
-        <w:t xml:space="preserve">        &lt;/span&gt;</w:t>
-        <w:br/>
-        <w:t xml:space="preserve">        &lt;h3 className="text-4xl md:text-6xl font-bold tracking-tight text-foreground mb-6"&gt;</w:t>
-        <w:br/>
-        <w:t xml:space="preserve">          {feature.title}</w:t>
-        <w:br/>
-        <w:t xml:space="preserve">        &lt;/h3&gt;</w:t>
-        <w:br/>
-        <w:t xml:space="preserve">        &lt;p className="text-lg md:text-xl text-muted-foreground max-w-md leading-relaxed"&gt;</w:t>
-        <w:br/>
-        <w:t xml:space="preserve">          {feature.description}</w:t>
-        <w:br/>
-        <w:t xml:space="preserve">        &lt;/p&gt;</w:t>
-        <w:br/>
-        <w:t xml:space="preserve">        &lt;div className="mt-8 h-px w-24 bg-gradient-to-r from-primary via-secondary to-accent" /&gt;</w:t>
-        <w:br/>
-        <w:t xml:space="preserve">      &lt;/div&gt;</w:t>
-        <w:br/>
-        <w:t xml:space="preserve">    &lt;/motion.div&gt;</w:t>
-        <w:br/>
-        <w:t xml:space="preserve">  );</w:t>
-        <w:br/>
-        <w:t>};</w:t>
-        <w:br/>
-        <w:br/>
-        <w:t>const ScrollFeatures = () =&gt; {</w:t>
-        <w:br/>
-        <w:t xml:space="preserve">  return (</w:t>
-        <w:br/>
-        <w:t xml:space="preserve">    &lt;div className="relative px-8 md:px-16 max-w-5xl mx-auto"&gt;</w:t>
-        <w:br/>
-        <w:t xml:space="preserve">      {features.map((feature, i) =&gt; (</w:t>
-        <w:br/>
-        <w:t xml:space="preserve">        &lt;FeatureCard key={feature.label} feature={feature} index={i} /&gt;</w:t>
-        <w:br/>
-        <w:t xml:space="preserve">      ))}</w:t>
-        <w:br/>
-        <w:t xml:space="preserve">    &lt;/div&gt;</w:t>
-        <w:br/>
-        <w:t xml:space="preserve">  );</w:t>
-        <w:br/>
-        <w:t>};</w:t>
-        <w:br/>
-        <w:br/>
-        <w:t>export default ScrollFeatures;</w:t>
-        <w:br/>
-      </w:r>
-    </w:p>
-    <w:p/>
-    <w:p>
-      <w:pPr>
-        <w:pStyle w:val="Heading2"/>
-      </w:pPr>
-      <w:r>
         <w:t>src/components/TiltCard.tsx</w:t>
       </w:r>
     </w:p>
@@ -4029,464 +3442,6 @@
         <w:br/>
         <w:br/>
         <w:t>export default TiltCard;</w:t>
-        <w:br/>
-      </w:r>
-    </w:p>
-    <w:p/>
-    <w:p>
-      <w:pPr>
-        <w:pStyle w:val="Heading2"/>
-      </w:pPr>
-      <w:r>
-        <w:t>◆  src/data/businessData.ts</w:t>
-      </w:r>
-    </w:p>
-    <w:p>
-      <w:pPr>
-        <w:spacing w:before="160" w:after="120"/>
-        <w:ind w:left="216" w:right="216"/>
-      </w:pPr>
-      <w:r>
-        <w:rPr>
-          <w:rFonts w:ascii="Calibri" w:hAnsi="Calibri"/>
-          <w:b/>
-          <w:sz w:val="20"/>
-          <w:highlight w:val="darkGray"/>
-        </w:rPr>
-        <w:t>FBLA Rubric: Program Readability — Identifiers &amp; documentation (JSDoc); Data storage interfaces (Business, Review, Event, Deal); Program documentation completeness.</w:t>
-      </w:r>
-    </w:p>
-    <w:p>
-      <w:pPr>
-        <w:spacing w:before="120" w:after="120"/>
-        <w:ind w:left="288"/>
-      </w:pPr>
-      <w:r>
-        <w:rPr>
-          <w:rFonts w:ascii="Consolas" w:hAnsi="Consolas"/>
-          <w:sz w:val="18"/>
-        </w:rPr>
-        <w:t>/**</w:t>
-        <w:br/>
-        <w:t xml:space="preserve"> * Business and related data for Cypress LocalLink directory.</w:t>
-        <w:br/>
-        <w:t xml:space="preserve"> * Contains static businesses, categories, events, and deals.</w:t>
-        <w:br/>
-        <w:t xml:space="preserve"> * User reviews are stored separately via useUserReviews (localStorage).</w:t>
-        <w:br/>
-        <w:t xml:space="preserve"> */</w:t>
-        <w:br/>
-        <w:br/>
-        <w:t>export interface Business {</w:t>
-        <w:br/>
-        <w:t xml:space="preserve">  id: string;</w:t>
-        <w:br/>
-        <w:t xml:space="preserve">  name: string;</w:t>
-        <w:br/>
-        <w:t xml:space="preserve">  category: string;</w:t>
-        <w:br/>
-        <w:t xml:space="preserve">  rating: number;</w:t>
-        <w:br/>
-        <w:t xml:space="preserve">  reviewCount: number;</w:t>
-        <w:br/>
-        <w:t xml:space="preserve">  address: string;</w:t>
-        <w:br/>
-        <w:t xml:space="preserve">  description: string;</w:t>
-        <w:br/>
-        <w:t xml:space="preserve">  image: string;</w:t>
-        <w:br/>
-        <w:t xml:space="preserve">  priceRange: string;</w:t>
-        <w:br/>
-        <w:t xml:space="preserve">  isOpen: boolean;</w:t>
-        <w:br/>
-        <w:t xml:space="preserve">  lat: number;</w:t>
-        <w:br/>
-        <w:t xml:space="preserve">  lng: number;</w:t>
-        <w:br/>
-        <w:t xml:space="preserve">  phone?: string;</w:t>
-        <w:br/>
-        <w:t xml:space="preserve">  tags?: string[];</w:t>
-        <w:br/>
-        <w:t>}</w:t>
-        <w:br/>
-        <w:br/>
-        <w:t>export interface Review {</w:t>
-        <w:br/>
-        <w:t xml:space="preserve">  id: string;</w:t>
-        <w:br/>
-        <w:t xml:space="preserve">  author: string;</w:t>
-        <w:br/>
-        <w:t xml:space="preserve">  initials: string;</w:t>
-        <w:br/>
-        <w:t xml:space="preserve">  date: string;</w:t>
-        <w:br/>
-        <w:t xml:space="preserve">  text: string;</w:t>
-        <w:br/>
-        <w:t xml:space="preserve">  rating: number;</w:t>
-        <w:br/>
-        <w:t>}</w:t>
-        <w:br/>
-        <w:br/>
-        <w:t>export interface Event {</w:t>
-        <w:br/>
-        <w:t xml:space="preserve">  id: string;</w:t>
-        <w:br/>
-        <w:t xml:space="preserve">  title: string;</w:t>
-        <w:br/>
-        <w:t xml:space="preserve">  date: string;</w:t>
-        <w:br/>
-        <w:t xml:space="preserve">  day: string;</w:t>
-        <w:br/>
-        <w:t xml:space="preserve">  month: string;</w:t>
-        <w:br/>
-        <w:t xml:space="preserve">  time: string;</w:t>
-        <w:br/>
-        <w:t xml:space="preserve">  location: string;</w:t>
-        <w:br/>
-        <w:t>}</w:t>
-        <w:br/>
-        <w:br/>
-        <w:t>export interface Deal {</w:t>
-        <w:br/>
-        <w:t xml:space="preserve">  id: string;</w:t>
-        <w:br/>
-        <w:t xml:space="preserve">  business_id: string;</w:t>
-        <w:br/>
-        <w:t xml:space="preserve">  title: string;</w:t>
-        <w:br/>
-        <w:t xml:space="preserve">  description: string;</w:t>
-        <w:br/>
-        <w:t xml:space="preserve">  discount: string;</w:t>
-        <w:br/>
-        <w:t xml:space="preserve">  valid_until: string;</w:t>
-        <w:br/>
-        <w:t>}</w:t>
-        <w:br/>
-        <w:br/>
-        <w:t>export const categories = [</w:t>
-        <w:br/>
-        <w:t xml:space="preserve">  { name: "Food &amp; Dining", slug: "Restaurant", image: "https://images.unsplash.com/photo-1414235077428-338989a2e8c0?w=400&amp;h=300&amp;fit=crop" },</w:t>
-        <w:br/>
-        <w:t xml:space="preserve">  { name: "Retail", slug: "Retail", image: "https://images.unsplash.com/photo-1441986300917-64674bd600d8?w=400&amp;h=300&amp;fit=crop" },</w:t>
-        <w:br/>
-        <w:t xml:space="preserve">  { name: "Health &amp; Fitness", slug: "Health &amp; Fitness", image: "https://images.unsplash.com/photo-1534438327276-14e5300c3a48?w=400&amp;h=300&amp;fit=crop" },</w:t>
-        <w:br/>
-        <w:t xml:space="preserve">  { name: "Services", slug: "Services", image: "https://images.unsplash.com/photo-1521791136064-7986c2920216?w=400&amp;h=300&amp;fit=crop" },</w:t>
-        <w:br/>
-        <w:t xml:space="preserve">  { name: "Automotive", slug: "Automotive", image: "https://images.unsplash.com/photo-1492144534655-ae79c964c9d7?w=400&amp;h=300&amp;fit=crop" },</w:t>
-        <w:br/>
-        <w:t xml:space="preserve">  { name: "Beauty &amp; Spa", slug: "Beauty &amp; Spa", image: "https://images.unsplash.com/photo-1560750588-73207b1ef5b8?w=400&amp;h=300&amp;fit=crop" },</w:t>
-        <w:br/>
-        <w:t xml:space="preserve">  { name: "Non-Profits", slug: "Non-Profit", image: "https://images.unsplash.com/photo-1559027615-cd4628902d4a?w=400&amp;h=300&amp;fit=crop" },</w:t>
-        <w:br/>
-        <w:t xml:space="preserve">  { name: "Entertainment", slug: "Entertainment", image: "https://images.unsplash.com/photo-1514306191717-452ec28c7814?w=400&amp;h=300&amp;fit=crop" },</w:t>
-        <w:br/>
-        <w:t xml:space="preserve">  { name: "Home &amp; Garden", slug: "Home &amp; Garden", image: "https://images.unsplash.com/photo-1416879595882-3373a0480b5b?w=400&amp;h=300&amp;fit=crop" },</w:t>
-        <w:br/>
-        <w:t xml:space="preserve">  { name: "Education", slug: "Education", image: "https://images.unsplash.com/photo-1503676260728-1c00da094a0b?w=400&amp;h=300&amp;fit=crop" },</w:t>
-        <w:br/>
-        <w:t>];</w:t>
-        <w:br/>
-        <w:br/>
-        <w:t>export const businesses: Business[] = [</w:t>
-        <w:br/>
-        <w:t xml:space="preserve">  // ── RESTAURANTS (20) ──</w:t>
-        <w:br/>
-        <w:t xml:space="preserve">  { id: "biz_rest_001", name: "Ambriza Social Mexican Kitchen", category: "Restaurant", rating: 4.8, reviewCount: 487, address: "Towne Lake Boardwalk", description: "Authentic Mexican flavors with a modern twist and lakeside views.", image: "https://images.unsplash.com/photo-1565299585323-38d6b0865b47?w=600&amp;h=400&amp;fit=crop", priceRange: "$$", isOpen: true, lat: 29.9691, lng: -95.6977, phone: "(281) 888-9999" },</w:t>
-        <w:br/>
-        <w:t xml:space="preserve">  { id: "biz_rest_002", name: "The Union Kitchen", category: "Restaurant", rating: 4.8, reviewCount: 345, address: "Towne Lake Boardwalk", description: "Neighborhood favorite serving American classics for brunch, lunch, and dinner. Great patio seating.", image: "https://images.unsplash.com/photo-1555396273-367ea4eb4db5?w=600&amp;h=400&amp;fit=crop", priceRange: "$$", isOpen: true, lat: 29.9695, lng: -95.6980, phone: "(281) 123-4567" },</w:t>
-        <w:br/>
-        <w:t xml:space="preserve">  { id: "biz_rest_003", name: "Crumbl Cookies", category: "Restaurant", rating: 4.9, reviewCount: 528, address: "Towne Lake Boardwalk", description: "The world's best cookies. Rotating menu of fresh baked gourmet cookies.", image: "https://images.unsplash.com/photo-1558961363-fa8fdf82db35?w=600&amp;h=400&amp;fit=crop", priceRange: "$", isOpen: true, lat: 29.9688, lng: -95.6973, phone: "(281) 555-0199" },</w:t>
-        <w:br/>
-        <w:t xml:space="preserve">  { id: "biz_rest_004", name: "BBQ Pit Masters", category: "Restaurant", rating: 4.7, reviewCount: 16, address: "369 Smoke Ring Road", description: "Slow-smoked Texas BBQ. Brisket, ribs, sausage and all the fixings.", image: "https://images.unsplash.com/photo-1529193591184-b1d58069ecdd?w=600&amp;h=400&amp;fit=crop", priceRange: "$$", isOpen: true, lat: 29.9710, lng: -95.6950 },</w:t>
-        <w:br/>
-        <w:t xml:space="preserve">  { id: "biz_rest_005", name: "Burger Barn", category: "Restaurant", rating: 4.5, reviewCount: 20, address: "789 Patty Lane", description: "Gourmet burgers made with local grass-fed beef. Craft shakes and loaded fries.", image: "https://images.unsplash.com/photo-1568901346375-23c9450c58cd?w=600&amp;h=400&amp;fit=crop", priceRange: "$$", isOpen: true, lat: 29.9675, lng: -95.6990 },</w:t>
-        <w:br/>
-        <w:t xml:space="preserve">  { id: "biz_rest_006", name: "Mod Pizza", category: "Restaurant", rating: 4.3, reviewCount: 18, address: "Towne Lake Boardwalk", description: "Build your own artisan-style pizza with unlimited toppings.", image: "https://images.unsplash.com/photo-1565299624946-b28f40a0ae38?w=600&amp;h=400&amp;fit=crop", priceRange: "$", isOpen: true, lat: 29.9693, lng: -95.6975 },</w:t>
-        <w:br/>
-        <w:t xml:space="preserve">  { id: "biz_rest_007", name: "Pho King Vietnamese", category: "Restaurant", rating: 4.6, reviewCount: 14, address: "234 Noodle Way", description: "Traditional Vietnamese pho and banh mi. Authentic family recipes since 1998.", image: "https://images.unsplash.com/photo-1582878826629-29b7ad1cdc43?w=600&amp;h=400&amp;fit=crop", priceRange: "$", isOpen: true, lat: 29.9702, lng: -95.6962 },</w:t>
-        <w:br/>
-        <w:t xml:space="preserve">  { id: "biz_rest_008", name: "Golden Dragon Chinese", category: "Restaurant", rating: 4.4, reviewCount: 22, address: "567 Dynasty Drive", description: "Cantonese and Szechuan cuisine. Dim sum on weekends.", image: "https://images.unsplash.com/photo-1563245372-f21724e3856d?w=600&amp;h=400&amp;fit=crop", priceRange: "$$", isOpen: true, lat: 29.9668, lng: -95.6998 },</w:t>
-        <w:br/>
-        <w:t xml:space="preserve">  { id: "biz_rest_009", name: "Sunrise Breakfast Café", category: "Restaurant", rating: 4.8, reviewCount: 31, address: "101 Morning Street", description: "Farm-fresh breakfast and brunch. Best pancakes in Cypress.", image: "https://images.unsplash.com/photo-1533089860892-a7c6f0a88666?w=600&amp;h=400&amp;fit=crop", priceRange: "$", isOpen: true, lat: 29.9718, lng: -95.6938 },</w:t>
-        <w:br/>
-        <w:t xml:space="preserve">  { id: "biz_rest_010", name: "Tuscany Italian Bistro", category: "Restaurant", rating: 4.6, reviewCount: 11, address: "445 Olive Garden Way", description: "Handmade pasta and wood-fired pizza. Romantic evening dining.", image: "https://images.unsplash.com/photo-1551183053-bf91a1d81141?w=600&amp;h=400&amp;fit=crop", priceRange: "$$$", isOpen: true, lat: 29.9660, lng: -95.7010 },</w:t>
-        <w:br/>
-        <w:t xml:space="preserve">  { id: "biz_rest_011", name: "Sushi Zen", category: "Restaurant", rating: 4.7, reviewCount: 19, address: "678 Pacific Blvd", description: "Premium sushi and sashimi. Omakase experience available.", image: "https://images.unsplash.com/photo-1579871494447-9811cf80d66c?w=600&amp;h=400&amp;fit=crop", priceRange: "$$$", isOpen: true, lat: 29.9682, lng: -95.6955 },</w:t>
-        <w:br/>
-        <w:t xml:space="preserve">  { id: "biz_rest_012", name: "Taco Loco", category: "Restaurant", rating: 4.5, reviewCount: 27, address: "321 Fiesta Ave", description: "Authentic street tacos and fresh margaritas. Late night hours.", image: "https://images.unsplash.com/photo-1551504734-5ee1c4a1479b?w=600&amp;h=400&amp;fit=crop", priceRange: "$", isOpen: true, lat: 29.9705, lng: -95.6942 },</w:t>
-        <w:br/>
-        <w:t xml:space="preserve">  { id: "biz_rest_013", name: "The Rustic Table", category: "Restaurant", rating: 4.8, reviewCount: 15, address: "890 Farm Road", description: "Farm-to-table dining with locally sourced ingredients. Seasonal menu.", image: "https://images.unsplash.com/photo-1414235077428-338989a2e8c0?w=600&amp;h=400&amp;fit=crop", priceRange: "$$$", isOpen: true, lat: 29.9655, lng: -95.7015 },</w:t>
-        <w:br/>
-        <w:t xml:space="preserve">  { id: "biz_rest_014", name: "Cypress Coffee Co.", category: "Restaurant", rating: 4.6, reviewCount: 35, address: "112 Bean Street", description: "Specialty coffee roasted in-house. Pastries, sandwiches, and cozy vibes.", image: "https://images.unsplash.com/photo-1501339847302-ac426a4a7cbb?w=600&amp;h=400&amp;fit=crop", priceRange: "$", isOpen: true, lat: 29.9697, lng: -95.6968 },</w:t>
-        <w:br/>
-        <w:t xml:space="preserve">  { id: "biz_rest_015", name: "Wings &amp; Things", category: "Restaurant", rating: 4.3, reviewCount: 21, address: "456 Buffalo Blvd", description: "50+ wing flavors. Sports bar with 30 screens.", image: "https://images.unsplash.com/photo-1567620832903-9fc6debc209f?w=600&amp;h=400&amp;fit=crop", priceRange: "$", isOpen: true, lat: 29.9712, lng: -95.6935 },</w:t>
-        <w:br/>
-        <w:t xml:space="preserve">  { id: "biz_rest_016", name: "Mediterranean Grill", category: "Restaurant", rating: 4.5, reviewCount: 13, address: "789 Olive Lane", description: "Kebabs, hummus, falafel, and shawarma. Family-owned since 2005.", image: "https://images.unsplash.com/photo-1544025162-d76694265947?w=600&amp;h=400&amp;fit=crop", priceRange: "$$", isOpen: true, lat: 29.9665, lng: -95.7005 },</w:t>
-        <w:br/>
-        <w:t xml:space="preserve">  { id: "biz_rest_017", name: "Sweet Treats Bakery", category: "Restaurant", rating: 4.9, reviewCount: 28, address: "234 Sugar Lane", description: "Custom cakes, cupcakes, and French pastries for every occasion.", image: "https://images.unsplash.com/photo-1486427944544-d2c246c4df4e?w=600&amp;h=400&amp;fit=crop", priceRange: "$$", isOpen: true, lat: 29.9690, lng: -95.6985 },</w:t>
-        <w:br/>
-        <w:t xml:space="preserve">  { id: "biz_rest_018", name: "Smokehouse Deli", category: "Restaurant", rating: 4.4, reviewCount: 17, address: "567 Sandwich Street", description: "Artisan deli sandwiches with house-smoked meats and fresh bread.", image: "https://images.unsplash.com/photo-1509722747041-616f39b57569?w=600&amp;h=400&amp;fit=crop", priceRange: "$", isOpen: true, lat: 29.9708, lng: -95.6948 },</w:t>
-        <w:br/>
-        <w:t xml:space="preserve">  { id: "biz_rest_019", name: "India Palace", category: "Restaurant", rating: 4.6, reviewCount: 10, address: "890 Spice Road", description: "Traditional Indian cuisine with a modern twist. Lunch buffet daily.", image: "https://images.unsplash.com/photo-1585937421612-70a008356fbe?w=600&amp;h=400&amp;fit=crop", priceRange: "$$", isOpen: true, lat: 29.9672, lng: -95.6995 },</w:t>
-        <w:br/>
-        <w:t xml:space="preserve">  { id: "biz_rest_020", name: "Frozen Bliss Ice Cream", category: "Restaurant", rating: 4.7, reviewCount: 33, address: "123 Dessert Drive", description: "Handcrafted small-batch ice cream. Unique flavors rotating weekly.", image: "https://images.unsplash.com/photo-1501443762994-82bd5dace89a?w=600&amp;h=400&amp;fit=crop", priceRange: "$", isOpen: true, lat: 29.9685, lng: -95.6972 },</w:t>
-        <w:br/>
-        <w:br/>
-        <w:t xml:space="preserve">  // ── RETAIL (12) ──</w:t>
-        <w:br/>
-        <w:t xml:space="preserve">  { id: "biz_ret_001", name: "The Book Corner", category: "Retail", rating: 4.9, reviewCount: 67, address: "789 Elm Street, Arts District", description: "Independent bookstore featuring local authors, rare finds, and weekly reading events. Coffee corner inside.", image: "https://images.unsplash.com/photo-1526243741027-444d633d7365?w=600&amp;h=400&amp;fit=crop", priceRange: "$", isOpen: true, lat: 29.9685, lng: -95.6965, phone: "(555) 345-6789" },</w:t>
-        <w:br/>
-        <w:t xml:space="preserve">  { id: "biz_ret_002", name: "Cozy Corner Bookstore", category: "Retail", rating: 4.6, reviewCount: 9, address: "321 Reader Lane", description: "Independent bookstore with curated selection and cozy reading nooks.", image: "https://images.unsplash.com/photo-1526243741027-444d633d7365?w=600&amp;h=400&amp;fit=crop", priceRange: "$", isOpen: true, lat: 29.9678, lng: -95.6985 },</w:t>
-        <w:br/>
-        <w:t xml:space="preserve">  { id: "biz_ret_003", name: "Cypress Flower Market", category: "Retail", rating: 4.7, reviewCount: 16, address: "456 Bloom Street", description: "Fresh flowers, arrangements, and plants. Wedding and event floristry.", image: "https://images.unsplash.com/photo-1487530811176-3780de880c2d?w=600&amp;h=400&amp;fit=crop", priceRange: "$$", isOpen: true, lat: 29.9700, lng: -95.6958 },</w:t>
-        <w:br/>
-        <w:t xml:space="preserve">  { id: "biz_ret_004", name: "Pet Paradise", category: "Retail", rating: 4.5, reviewCount: 22, address: "789 Furry Friend Lane", description: "Premium pet supplies, grooming, and adoption events. All natural foods.", image: "https://images.unsplash.com/photo-1601758228041-f3b2795255f1?w=600&amp;h=400&amp;fit=crop", priceRange: "$$", isOpen: true, lat: 29.9715, lng: -95.6932 },</w:t>
-        <w:br/>
-        <w:t xml:space="preserve">  { id: "biz_ret_005", name: "Tech Hub Electronics", category: "Retail", rating: 4.3, reviewCount: 18, address: "234 Circuit Ave", description: "Latest gadgets, computer repairs, and tech accessories.", image: "https://images.unsplash.com/photo-1531297484001-80022131f5a1?w=600&amp;h=400&amp;fit=crop", priceRange: "$$", isOpen: true, lat: 29.9662, lng: -95.7008 },</w:t>
-        <w:br/>
-        <w:t xml:space="preserve">  { id: "biz_ret_006", name: "Vintage Finds Antiques", category: "Retail", rating: 4.8, reviewCount: 8, address: "567 Heritage Blvd", description: "Curated antiques and vintage collectibles. Estate jewelry and furniture.", image: "https://images.unsplash.com/photo-1558618666-fcd25c85f82e?w=600&amp;h=400&amp;fit=crop", priceRange: "$$$", isOpen: true, lat: 29.9680, lng: -95.6978 },</w:t>
-        <w:br/>
-        <w:t xml:space="preserve">  { id: "biz_ret_007", name: "Outdoor Adventure Outfitters", category: "Retail", rating: 4.6, reviewCount: 14, address: "890 Trail Road", description: "Camping, hiking, and outdoor gear. Expert staff for trip planning.", image: "https://images.unsplash.com/photo-1504280390367-361c6d9f38f4?w=600&amp;h=400&amp;fit=crop", priceRange: "$$", isOpen: true, lat: 29.9706, lng: -95.6945 },</w:t>
-        <w:br/>
-        <w:t xml:space="preserve">  { id: "biz_ret_008", name: "Little Ones Children's Boutique", category: "Retail", rating: 4.7, reviewCount: 11, address: "123 Kiddo Street", description: "Adorable children's clothing, toys, and gifts. Locally curated brands.", image: "https://images.unsplash.com/photo-1566454544259-f4b94c3d758c?w=600&amp;h=400&amp;fit=crop", priceRange: "$$", isOpen: true, lat: 29.9692, lng: -95.6960 },</w:t>
-        <w:br/>
-        <w:t xml:space="preserve">  { id: "biz_ret_009", name: "Green Thumb Garden Center", category: "Retail", rating: 4.5, reviewCount: 20, address: "456 Plant Way", description: "Native Texas plants, trees, and landscaping supplies. Expert garden advice.", image: "https://images.unsplash.com/photo-1416879595882-3373a0480b5b?w=600&amp;h=400&amp;fit=crop", priceRange: "$$", isOpen: true, lat: 29.9668, lng: -95.7002 },</w:t>
-        <w:br/>
-        <w:t xml:space="preserve">  { id: "biz_ret_010", name: "Cypress Sports &amp; Collectibles", category: "Retail", rating: 4.4, reviewCount: 12, address: "789 Trophy Lane", description: "Sports memorabilia, trading cards, and fan gear for all Houston teams.", image: "https://images.unsplash.com/photo-1461896836934-bd45ba8a0a56?w=600&amp;h=400&amp;fit=crop", priceRange: "$$", isOpen: true, lat: 29.9718, lng: -95.6928 },</w:t>
-        <w:br/>
-        <w:t xml:space="preserve">  { id: "biz_ret_011", name: "Stitch &amp; Thread Fabrics", category: "Retail", rating: 4.6, reviewCount: 7, address: "234 Quilting Road", description: "Fine fabrics, sewing supplies, and quilting classes. Custom alterations.", image: "https://images.unsplash.com/photo-1558171813-4c088753af8f?w=600&amp;h=400&amp;fit=crop", priceRange: "$$", isOpen: true, lat: 29.9674, lng: -95.6992 },</w:t>
-        <w:br/>
-        <w:t xml:space="preserve">  { id: "biz_ret_012", name: "Cypress Wine &amp; Spirits", category: "Retail", rating: 4.7, reviewCount: 25, address: "567 Vineyard Blvd", description: "Curated wine selection, craft spirits, and weekly tasting events.", image: "https://images.unsplash.com/photo-1516594915697-87eb3b1c14ea?w=600&amp;h=400&amp;fit=crop", priceRange: "$$", isOpen: true, lat: 29.9695, lng: -95.6952 },</w:t>
-        <w:br/>
-        <w:br/>
-        <w:t xml:space="preserve">  // ── HEALTH &amp; FITNESS (10) ──</w:t>
-        <w:br/>
-        <w:t xml:space="preserve">  { id: "biz_fit_001", name: "Club Pilates", category: "Health &amp; Fitness", rating: 4.8, reviewCount: 156, address: "Towne Lake Boardwalk", description: "Premium reformer-based pilates training for all fitness levels. Restore your body and mind.", image: "https://images.unsplash.com/photo-1518611012118-696072aa579a?w=600&amp;h=400&amp;fit=crop", priceRange: "$$", isOpen: true, lat: 29.9692, lng: -95.6982, phone: "(281) 234-5678" },</w:t>
-        <w:br/>
-        <w:t xml:space="preserve">  { id: "biz_fit_002", name: "Aqua Fitness Center", category: "Health &amp; Fitness", rating: 4.4, reviewCount: 22, address: "222 Splash Lane", description: "Olympic-size pool, water aerobics, and swim lessons.", image: "https://images.unsplash.com/photo-1576013551627-0cc20b96c2a7?w=600&amp;h=400&amp;fit=crop", priceRange: "$$", isOpen: true, lat: 29.9700, lng: -95.6960 },</w:t>
-        <w:br/>
-        <w:t xml:space="preserve">  { id: "biz_fit_003", name: "CrossFit Cypress", category: "Health &amp; Fitness", rating: 4.7, reviewCount: 15, address: "333 WOD Way", description: "High-intensity functional fitness. Experienced coaches, all skill levels.", image: "https://images.unsplash.com/photo-1534438327276-14e5300c3a48?w=600&amp;h=400&amp;fit=crop", priceRange: "$$", isOpen: true, lat: 29.9708, lng: -95.6940 },</w:t>
-        <w:br/>
-        <w:t xml:space="preserve">  { id: "biz_fit_004", name: "Yoga Garden Studio", category: "Health &amp; Fitness", rating: 4.9, reviewCount: 26, address: "456 Zen Path", description: "Vinyasa, hot yoga, and meditation classes. Serene garden setting.", image: "https://images.unsplash.com/photo-1544367567-0f2fcb009e0b?w=600&amp;h=400&amp;fit=crop", priceRange: "$$", isOpen: true, lat: 29.9665, lng: -95.7005 },</w:t>
-        <w:br/>
-        <w:t xml:space="preserve">  { id: "biz_fit_005", name: "Iron Works Gym", category: "Health &amp; Fitness", rating: 4.5, reviewCount: 30, address: "789 Muscle Blvd", description: "Full gym with free weights, machines, and personal training.", image: "https://images.unsplash.com/photo-1540497077202-7c8a3999166f?w=600&amp;h=400&amp;fit=crop", priceRange: "$", isOpen: true, lat: 29.9720, lng: -95.6925 },</w:t>
-        <w:br/>
-        <w:t xml:space="preserve">  { id: "biz_fit_006", name: "Dance Fusion Studio", category: "Health &amp; Fitness", rating: 4.6, reviewCount: 12, address: "234 Rhythm Road", description: "Zumba, hip-hop, ballet, and salsa classes for all ages.", image: "https://images.unsplash.com/photo-1508700929628-666bc8bd84ea?w=600&amp;h=400&amp;fit=crop", priceRange: "$$", isOpen: true, lat: 29.9678, lng: -95.6988 },</w:t>
-        <w:br/>
-        <w:t xml:space="preserve">  { id: "biz_fit_007", name: "Cypress Martial Arts", category: "Health &amp; Fitness", rating: 4.7, reviewCount: 19, address: "567 Dojo Drive", description: "Karate, Brazilian Jiu-Jitsu, and self-defense. Kids and adult programs.", image: "https://images.unsplash.com/photo-1555597673-b21d5c935865?w=600&amp;h=400&amp;fit=crop", priceRange: "$$", isOpen: true, lat: 29.9702, lng: -95.6955 },</w:t>
-        <w:br/>
-        <w:t xml:space="preserve">  { id: "biz_fit_008", name: "Cycle Bar Cypress", category: "Health &amp; Fitness", rating: 4.5, reviewCount: 14, address: "890 Spin Street", description: "Premium indoor cycling. High-energy classes with performance tracking.", image: "https://images.unsplash.com/photo-1534787238916-9ba6764efd4f?w=600&amp;h=400&amp;fit=crop", priceRange: "$$", isOpen: true, lat: 29.9660, lng: -95.7012 },</w:t>
-        <w:br/>
-        <w:t xml:space="preserve">  { id: "biz_fit_009", name: "Chiropractic Wellness Center", category: "Health &amp; Fitness", rating: 4.6, reviewCount: 17, address: "123 Spine Way", description: "Chiropractic adjustments, sports rehab, and wellness programs.", image: "https://images.unsplash.com/photo-1519824145371-296894a0daa9?w=600&amp;h=400&amp;fit=crop", priceRange: "$$", isOpen: true, lat: 29.9688, lng: -95.6975 },</w:t>
-        <w:br/>
-        <w:t xml:space="preserve">  { id: "biz_fit_010", name: "Mind &amp; Body Wellness", category: "Health &amp; Fitness", rating: 4.8, reviewCount: 9, address: "456 Harmony Lane", description: "Holistic health services. Acupuncture, nutrition, and wellness coaching.", image: "https://images.unsplash.com/photo-1600618528240-fb9fc964b853?w=600&amp;h=400&amp;fit=crop", priceRange: "$$$", isOpen: true, lat: 29.9712, lng: -95.6932 },</w:t>
-        <w:br/>
-        <w:br/>
-        <w:t xml:space="preserve">  // ── BEAUTY &amp; SPA (8) ──</w:t>
-        <w:br/>
-        <w:t xml:space="preserve">  { id: "biz_beauty_001", name: "Bella Hair Studio", category: "Beauty &amp; Spa", rating: 4.8, reviewCount: 156, address: "567 Fashion Ave", description: "Full-service hair salon offering cuts, color, styling, and spa treatments. Award-winning stylists.", image: "https://images.unsplash.com/photo-1560066984-138dadb4c035?w=600&amp;h=400&amp;fit=crop", priceRange: "$$", isOpen: true, lat: 29.9680, lng: -95.6970, phone: "(555) 567-8901" },</w:t>
-        <w:br/>
-        <w:t xml:space="preserve">  { id: "biz_beauty_002", name: "Zen Day Spa", category: "Beauty &amp; Spa", rating: 4.7, reviewCount: 11, address: "890 Serenity Blvd", description: "Relaxation and rejuvenation. Massages, facials, and body treatments.", image: "https://images.unsplash.com/photo-1544161515-4ab6ce6db874?w=600&amp;h=400&amp;fit=crop", priceRange: "$$$", isOpen: true, lat: 29.9705, lng: -95.6955 },</w:t>
-        <w:br/>
-        <w:t xml:space="preserve">  { id: "biz_beauty_003", name: "Nails by Nicole", category: "Beauty &amp; Spa", rating: 4.6, reviewCount: 23, address: "123 Polish Place", description: "Manicures, pedicures, and nail art. Clean, relaxing atmosphere.", image: "https://images.unsplash.com/photo-1604654894610-df63bc536371?w=600&amp;h=400&amp;fit=crop", priceRange: "$", isOpen: true, lat: 29.9670, lng: -95.6998 },</w:t>
-        <w:br/>
-        <w:t xml:space="preserve">  { id: "biz_beauty_004", name: "Glow Skin Bar", category: "Beauty &amp; Spa", rating: 4.8, reviewCount: 10, address: "456 Radiance Road", description: "Advanced skincare treatments. Facials, peels, and microneedling.", image: "https://images.unsplash.com/photo-1570172619644-dfd03ed5d881?w=600&amp;h=400&amp;fit=crop", priceRange: "$$$", isOpen: true, lat: 29.9698, lng: -95.6945 },</w:t>
-        <w:br/>
-        <w:t xml:space="preserve">  { id: "biz_beauty_005", name: "The Barber Lounge", category: "Beauty &amp; Spa", rating: 4.7, reviewCount: 28, address: "789 Clipper Blvd", description: "Classic barbershop experience. Straight razor shaves and craft cuts.", image: "https://images.unsplash.com/photo-1503951914875-452162b0f3f1?w=600&amp;h=400&amp;fit=crop", priceRange: "$", isOpen: true, lat: 29.9716, lng: -95.6930 },</w:t>
-        <w:br/>
-        <w:t xml:space="preserve">  { id: "biz_beauty_006", name: "Lash &amp; Brow Studio", category: "Beauty &amp; Spa", rating: 4.5, reviewCount: 14, address: "234 Beauty Lane", description: "Eyelash extensions, brow shaping, and lash lifts. Certified technicians.", image: "https://images.unsplash.com/photo-1522337360788-8b13dee7a37e?w=600&amp;h=400&amp;fit=crop", priceRange: "$$", isOpen: true, lat: 29.9675, lng: -95.6988 },</w:t>
-        <w:br/>
-        <w:t xml:space="preserve">  { id: "biz_beauty_007", name: "Serenity Float Spa", category: "Beauty &amp; Spa", rating: 4.9, reviewCount: 6, address: "567 Calm Court", description: "Sensory deprivation float tanks. Deep relaxation and recovery.", image: "https://images.unsplash.com/photo-1540555700478-4be289fbec6b?w=600&amp;h=400&amp;fit=crop", priceRange: "$$$", isOpen: true, lat: 29.9690, lng: -95.6965 },</w:t>
-        <w:br/>
-        <w:t xml:space="preserve">  { id: "biz_beauty_008", name: "Color Me Beautiful Salon", category: "Beauty &amp; Spa", rating: 4.6, reviewCount: 19, address: "890 Style Street", description: "Hair color specialists. Balayage, highlights, and vivid color experts.", image: "https://images.unsplash.com/photo-1562322140-8baeececf3df?w=600&amp;h=400&amp;fit=crop", priceRange: "$$", isOpen: true, lat: 29.9708, lng: -95.6942 },</w:t>
-        <w:br/>
-        <w:br/>
-        <w:t xml:space="preserve">  // ── AUTOMOTIVE (7) ──</w:t>
-        <w:br/>
-        <w:t xml:space="preserve">  { id: "biz_auto_001", name: "Premier Auto Care", category: "Automotive", rating: 4.6, reviewCount: 112, address: "321 Industrial Blvd", description: "Trusted auto repair and maintenance. ASE certified mechanics, fair prices, and honest service since 1998.", image: "https://images.unsplash.com/photo-1487754180451-c456f719a1fc?w=600&amp;h=400&amp;fit=crop", priceRange: "$$", isOpen: true, lat: 29.9715, lng: -95.6945, phone: "(555) 456-7890" },</w:t>
-        <w:br/>
-        <w:t xml:space="preserve">  { id: "biz_auto_002", name: "Cypress Auto Care", category: "Automotive", rating: 4.6, reviewCount: 32, address: "123 Motor Lane", description: "Full-service auto repair and maintenance. ASE certified mechanics.", image: "https://images.unsplash.com/photo-1487754180451-c456f719a1fc?w=600&amp;h=400&amp;fit=crop", priceRange: "$$", isOpen: true, lat: 29.9668, lng: -95.7000 },</w:t>
-        <w:br/>
-        <w:t xml:space="preserve">  { id: "biz_auto_003", name: "Express Oil Change", category: "Automotive", rating: 4.3, reviewCount: 45, address: "456 Quick Lube Drive", description: "Fast oil changes and basic maintenance. No appointment needed.", image: "https://images.unsplash.com/photo-1565043589221-1a6fd9ae45c7?w=600&amp;h=400&amp;fit=crop", priceRange: "$", isOpen: true, lat: 29.9700, lng: -95.6955 },</w:t>
-        <w:br/>
-        <w:t xml:space="preserve">  { id: "biz_auto_004", name: "Sparkle Car Wash", category: "Automotive", rating: 4.4, reviewCount: 38, address: "789 Clean Street", description: "Full-service car wash and detailing. Monthly unlimited plans available.", image: "https://images.unsplash.com/photo-1520340356584-f9917d1eea6f?w=600&amp;h=400&amp;fit=crop", priceRange: "$", isOpen: true, lat: 29.9682, lng: -95.6980 },</w:t>
-        <w:br/>
-        <w:t xml:space="preserve">  { id: "biz_auto_005", name: "Tire Town", category: "Automotive", rating: 4.5, reviewCount: 21, address: "234 Rubber Road", description: "New and used tires. Alignments, balancing, and brake service.", image: "https://images.unsplash.com/photo-1580273916550-e323be2ae537?w=600&amp;h=400&amp;fit=crop", priceRange: "$$", isOpen: true, lat: 29.9722, lng: -95.6920 },</w:t>
-        <w:br/>
-        <w:t xml:space="preserve">  { id: "biz_auto_006", name: "Elite Auto Glass", category: "Automotive", rating: 4.6, reviewCount: 12, address: "567 Windshield Way", description: "Windshield repair and replacement. Mobile service available.", image: "https://images.unsplash.com/photo-1449824913935-59a10b8d2000?w=600&amp;h=400&amp;fit=crop", priceRange: "$$", isOpen: true, lat: 29.9660, lng: -95.7015 },</w:t>
-        <w:br/>
-        <w:t xml:space="preserve">  { id: "biz_auto_007", name: "Custom Wheels &amp; Audio", category: "Automotive", rating: 4.7, reviewCount: 9, address: "890 Chrome Blvd", description: "Custom wheels, audio systems, and vehicle accessories.", image: "https://images.unsplash.com/photo-1492144534655-ae79c964c9d7?w=600&amp;h=400&amp;fit=crop", priceRange: "$$$", isOpen: true, lat: 29.9695, lng: -95.6968 },</w:t>
-        <w:br/>
-        <w:br/>
-        <w:t xml:space="preserve">  // ── SERVICES (10) ──</w:t>
-        <w:br/>
-        <w:t xml:space="preserve">  { id: "biz_svc_001", name: "Ace Hardware &amp; Supply", category: "Services", rating: 4.5, reviewCount: 15, address: "444 Builder Road", description: "Your neighborhood hardware store. Tools, paint, plumbing supplies, and helpful advice.", image: "https://images.unsplash.com/photo-1504148455328-c376907d081c?w=600&amp;h=400&amp;fit=crop", priceRange: "$$", isOpen: true, lat: 29.9698, lng: -95.6940 },</w:t>
-        <w:br/>
-        <w:t xml:space="preserve">  { id: "biz_svc_002", name: "Bright Smile Dentistry", category: "Services", rating: 4.4, reviewCount: 19, address: "555 Medical Center Dr", description: "Family dentistry with a gentle touch. Cleanings, cosmetic, and orthodontics.", image: "https://images.unsplash.com/photo-1629909613654-28e377c37b09?w=600&amp;h=400&amp;fit=crop", priceRange: "$$", isOpen: true, lat: 29.9720, lng: -95.6935 },</w:t>
-        <w:br/>
-        <w:t xml:space="preserve">  { id: "biz_svc_003", name: "Cypress Tax Professionals", category: "Services", rating: 4.7, reviewCount: 11, address: "123 Finance Way", description: "Personal and business tax preparation. Year-round accounting services.", image: "https://images.unsplash.com/photo-1554224155-8d04cb21cd6c?w=600&amp;h=400&amp;fit=crop", priceRange: "$$", isOpen: true, lat: 29.9672, lng: -95.6995 },</w:t>
-        <w:br/>
-        <w:t xml:space="preserve">  { id: "biz_svc_004", name: "Print &amp; Ship Center", category: "Services", rating: 4.3, reviewCount: 16, address: "456 Postal Plaza", description: "Printing, copying, shipping, and mailbox rental. Notary services.", image: "https://images.unsplash.com/photo-1568702846914-96b305d2aaeb?w=600&amp;h=400&amp;fit=crop", priceRange: "$", isOpen: true, lat: 29.9705, lng: -95.6948 },</w:t>
-        <w:br/>
-        <w:t xml:space="preserve">  { id: "biz_svc_005", name: "Cypress Veterinary Clinic", category: "Services", rating: 4.8, reviewCount: 27, address: "789 Pet Care Lane", description: "Compassionate veterinary care. Wellness exams, surgery, and boarding.", image: "https://images.unsplash.com/photo-1628009368231-7bb7cfcb0def?w=600&amp;h=400&amp;fit=crop", priceRange: "$$", isOpen: true, lat: 29.9658, lng: -95.7018 },</w:t>
-        <w:br/>
-        <w:t xml:space="preserve">  { id: "biz_svc_006", name: "Legal Eagle Law Firm", category: "Services", rating: 4.6, reviewCount: 8, address: "234 Justice Drive", description: "Family law, estate planning, and real estate closings. Free consultations.", image: "https://images.unsplash.com/photo-1589829545856-d10d557cf95f?w=600&amp;h=400&amp;fit=crop", priceRange: "$$$", isOpen: true, lat: 29.9688, lng: -95.6972 },</w:t>
-        <w:br/>
-        <w:t xml:space="preserve">  { id: "biz_svc_007", name: "Cypress Cleaners", category: "Services", rating: 4.4, reviewCount: 24, address: "567 Fresh Street", description: "Dry cleaning, laundry, and alterations. Same-day service available.", image: "https://images.unsplash.com/photo-1545173168-9f1947eebb7f?w=600&amp;h=400&amp;fit=crop", priceRange: "$", isOpen: true, lat: 29.9710, lng: -95.6938 },</w:t>
-        <w:br/>
-        <w:t xml:space="preserve">  { id: "biz_svc_008", name: "Home Shield Insurance", category: "Services", rating: 4.5, reviewCount: 13, address: "890 Coverage Road", description: "Home, auto, and life insurance. Local agent with personalized service.", image: "https://images.unsplash.com/photo-1560518883-ce09059eeffa?w=600&amp;h=400&amp;fit=crop", priceRange: "$$", isOpen: true, lat: 29.9665, lng: -95.7008 },</w:t>
-        <w:br/>
-        <w:t xml:space="preserve">  { id: "biz_svc_009", name: "Cypress Plumbing Pros", category: "Services", rating: 4.7, reviewCount: 20, address: "123 Pipe Way", description: "24/7 emergency plumbing. Residential and commercial. Licensed and insured.", image: "https://images.unsplash.com/photo-1585704032915-c3400ca199e7?w=600&amp;h=400&amp;fit=crop", priceRange: "$$", isOpen: true, lat: 29.9700, lng: -95.6952 },</w:t>
-        <w:br/>
-        <w:t xml:space="preserve">  { id: "biz_svc_010", name: "Sparks Electric Co.", category: "Services", rating: 4.6, reviewCount: 15, address: "456 Watt Drive", description: "Residential electrical services. Panel upgrades, lighting, and smart home.", image: "https://images.unsplash.com/photo-1621905252507-b35492cc74b4?w=600&amp;h=400&amp;fit=crop", priceRange: "$$", isOpen: true, lat: 29.9678, lng: -95.6985 },</w:t>
-        <w:br/>
-        <w:br/>
-        <w:t xml:space="preserve">  // ── NON-PROFITS (8) ──</w:t>
-        <w:br/>
-        <w:t xml:space="preserve">  { id: "biz_np_001", name: "Cypress Community Food Bank", category: "Non-Profit", rating: 4.9, reviewCount: 89, address: "100 Community Way", description: "Free food pantry and emergency groceries for Cypress residents in need. Volunteer-run, open weekly.", image: "https://images.unsplash.com/photo-1593113598332-cd288d649433?w=600&amp;h=400&amp;fit=crop", priceRange: "Free", isOpen: true, lat: 29.9670, lng: -95.7000, phone: "(281) 555-0100" },</w:t>
-        <w:br/>
-        <w:t xml:space="preserve">  { id: "biz_np_002", name: "Cypress Youth Foundation", category: "Non-Profit", rating: 4.8, reviewCount: 14, address: "234 Youth Way", description: "After-school programs, mentoring, and scholarships for Cypress youth.", image: "https://images.unsplash.com/photo-1488521787991-ed7bbaae773c?w=600&amp;h=400&amp;fit=crop", priceRange: "Free", isOpen: true, lat: 29.9695, lng: -95.6962 },</w:t>
-        <w:br/>
-        <w:t xml:space="preserve">  { id: "biz_np_003", name: "Habitat for Humanity Cypress", category: "Non-Profit", rating: 4.9, reviewCount: 18, address: "567 Build Hope Lane", description: "Building affordable homes and community. Volunteer and donate.", image: "https://images.unsplash.com/photo-1469571486292-0ba58a3f068b?w=600&amp;h=400&amp;fit=crop", priceRange: "Free", isOpen: true, lat: 29.9712, lng: -95.6938 },</w:t>
-        <w:br/>
-        <w:t xml:space="preserve">  { id: "biz_np_004", name: "Cypress Animal Rescue", category: "Non-Profit", rating: 4.7, reviewCount: 25, address: "890 Rescue Road", description: "Animal rescue and adoption. Foster programs and community education.", image: "https://images.unsplash.com/photo-1601758228041-f3b2795255f1?w=600&amp;h=400&amp;fit=crop", priceRange: "Free", isOpen: true, lat: 29.9662, lng: -95.7010 },</w:t>
-        <w:br/>
-        <w:t xml:space="preserve">  { id: "biz_np_005", name: "Senior Services Center", category: "Non-Profit", rating: 4.8, reviewCount: 11, address: "123 Golden Years Blvd", description: "Activities, meals, and support services for seniors. Transportation available.", image: "https://images.unsplash.com/photo-1517457373958-b7bdd4587205?w=600&amp;h=400&amp;fit=crop", priceRange: "Free", isOpen: true, lat: 29.9688, lng: -95.6978 },</w:t>
-        <w:br/>
-        <w:t xml:space="preserve">  { id: "biz_np_006", name: "Cypress Literacy Council", category: "Non-Profit", rating: 4.6, reviewCount: 8, address: "456 Reading Road", description: "Adult literacy programs, ESL classes, and GED preparation.", image: "https://images.unsplash.com/photo-1503676260728-1c00da094a0b?w=600&amp;h=400&amp;fit=crop", priceRange: "Free", isOpen: true, lat: 29.9705, lng: -95.6950 },</w:t>
-        <w:br/>
-        <w:t xml:space="preserve">  { id: "biz_np_007", name: "Green Cypress Environmental", category: "Non-Profit", rating: 4.7, reviewCount: 9, address: "789 Earth Way", description: "Environmental conservation, tree planting, and community clean-ups.", image: "https://images.unsplash.com/photo-1542601906990-b4d3fb778b09?w=600&amp;h=400&amp;fit=crop", priceRange: "Free", isOpen: true, lat: 29.9718, lng: -95.6928 },</w:t>
-        <w:br/>
-        <w:t xml:space="preserve">  { id: "biz_np_008", name: "Cypress Arts Council", category: "Non-Profit", rating: 4.5, reviewCount: 12, address: "234 Creative Blvd", description: "Promoting local arts through exhibitions, workshops, and community events.", image: "https://images.unsplash.com/photo-1460661419201-fd4cecdf8a8b?w=600&amp;h=400&amp;fit=crop", priceRange: "Free", isOpen: true, lat: 29.9672, lng: -95.6992 },</w:t>
-        <w:br/>
-        <w:br/>
-        <w:t xml:space="preserve">  // ── ENTERTAINMENT (6) ──</w:t>
-        <w:br/>
-        <w:t xml:space="preserve">  { id: "biz_ent_001", name: "Cypress Bowling Alley", category: "Entertainment", rating: 4.4, reviewCount: 29, address: "123 Strike Lane", description: "32 lanes, arcade games, and cosmic bowling nights. Party packages available.", image: "https://images.unsplash.com/photo-1545232979-8bf68ee9b1af?w=600&amp;h=400&amp;fit=crop", priceRange: "$$", isOpen: true, lat: 29.9690, lng: -95.6970 },</w:t>
-        <w:br/>
-        <w:t xml:space="preserve">  { id: "biz_ent_002", name: "Escape Room Cypress", category: "Entertainment", rating: 4.7, reviewCount: 16, address: "456 Mystery Way", description: "Immersive escape room experiences. 6 themed rooms for all skill levels.", image: "https://images.unsplash.com/photo-1616161560417-66d4db5892ec?w=600&amp;h=400&amp;fit=crop", priceRange: "$$", isOpen: true, lat: 29.9702, lng: -95.6958 },</w:t>
-        <w:br/>
-        <w:t xml:space="preserve">  { id: "biz_ent_003", name: "Cypress Cinema 12", category: "Entertainment", rating: 4.5, reviewCount: 42, address: "789 Movie Blvd", description: "Luxury recliner seating, IMAX, and dine-in theater experience.", image: "https://images.unsplash.com/photo-1489599849927-2ee91cede3ba?w=600&amp;h=400&amp;fit=crop", priceRange: "$$", isOpen: true, lat: 29.9665, lng: -95.7005 },</w:t>
-        <w:br/>
-        <w:t xml:space="preserve">  { id: "biz_ent_004", name: "Jump Zone Trampoline Park", category: "Entertainment", rating: 4.3, reviewCount: 35, address: "234 Bounce Drive", description: "Indoor trampoline park, ninja course, and foam pit. Birthday parties.", image: "https://images.unsplash.com/photo-1551966775-a4ddc8df052b?w=600&amp;h=400&amp;fit=crop", priceRange: "$$", isOpen: true, lat: 29.9715, lng: -95.6935 },</w:t>
-        <w:br/>
-        <w:t xml:space="preserve">  { id: "biz_ent_005", name: "TopGolf Cypress", category: "Entertainment", rating: 4.6, reviewCount: 50, address: "567 Tee Time Road", description: "High-tech driving range with games, food, and drinks. Year-round fun.", image: "https://images.unsplash.com/photo-1535131749006-b7f58c99034b?w=600&amp;h=400&amp;fit=crop", priceRange: "$$$", isOpen: true, lat: 29.9658, lng: -95.7012 },</w:t>
-        <w:br/>
-        <w:t xml:space="preserve">  { id: "biz_ent_006", name: "Paint &amp; Sip Studio", category: "Entertainment", rating: 4.8, reviewCount: 13, address: "890 Canvas Court", description: "Guided painting classes with wine and cocktails. Private events welcome.", image: "https://images.unsplash.com/photo-1460661419201-fd4cecdf8a8b?w=600&amp;h=400&amp;fit=crop", priceRange: "$$", isOpen: true, lat: 29.9685, lng: -95.6975 },</w:t>
-        <w:br/>
-        <w:br/>
-        <w:t xml:space="preserve">  // ── HOME &amp; GARDEN (6) ──</w:t>
-        <w:br/>
-        <w:t xml:space="preserve">  { id: "biz_hg_001", name: "Cypress Lumber &amp; Supply", category: "Home &amp; Garden", rating: 4.5, reviewCount: 14, address: "123 Timber Trail", description: "Quality lumber, building materials, and contractor supplies.", image: "https://images.unsplash.com/photo-1504148455328-c376907d081c?w=600&amp;h=400&amp;fit=crop", priceRange: "$$", isOpen: true, lat: 29.9700, lng: -95.6945 },</w:t>
-        <w:br/>
-        <w:t xml:space="preserve">  { id: "biz_hg_002", name: "Dream Kitchens &amp; Bath", category: "Home &amp; Garden", rating: 4.8, reviewCount: 10, address: "456 Remodel Road", description: "Kitchen and bathroom remodeling. Custom cabinets and countertops.", image: "https://images.unsplash.com/photo-1556909114-f6e7ad7d3136?w=600&amp;h=400&amp;fit=crop", priceRange: "$$$", isOpen: true, lat: 29.9668, lng: -95.7002 },</w:t>
-        <w:br/>
-        <w:t xml:space="preserve">  { id: "biz_hg_003", name: "Pool &amp; Patio Pros", category: "Home &amp; Garden", rating: 4.6, reviewCount: 18, address: "789 Backyard Blvd", description: "Pool construction, maintenance, and patio design. Outdoor living experts.", image: "https://images.unsplash.com/photo-1576013551627-0cc20b96c2a7?w=600&amp;h=400&amp;fit=crop", priceRange: "$$$", isOpen: true, lat: 29.9720, lng: -95.6925 },</w:t>
-        <w:br/>
-        <w:t xml:space="preserve">  { id: "biz_hg_004", name: "Cypress Landscape Design", category: "Home &amp; Garden", rating: 4.7, reviewCount: 12, address: "234 Garden Path", description: "Custom landscape design, installation, and maintenance.", image: "https://images.unsplash.com/photo-1416879595882-3373a0480b5b?w=600&amp;h=400&amp;fit=crop", priceRange: "$$", isOpen: true, lat: 29.9682, lng: -95.6980 },</w:t>
-        <w:br/>
-        <w:t xml:space="preserve">  { id: "biz_hg_005", name: "Smart Home Solutions", category: "Home &amp; Garden", rating: 4.5, reviewCount: 8, address: "567 Tech Way", description: "Home automation, security systems, and smart lighting installation.", image: "https://images.unsplash.com/photo-1558002038-1055907df827?w=600&amp;h=400&amp;fit=crop", priceRange: "$$", isOpen: true, lat: 29.9695, lng: -95.6960 },</w:t>
-        <w:br/>
-        <w:t xml:space="preserve">  { id: "biz_hg_006", name: "Furniture Gallery Cypress", category: "Home &amp; Garden", rating: 4.4, reviewCount: 15, address: "890 Décor Drive", description: "Quality home furniture and decor. Living rooms, bedrooms, and dining.", image: "https://images.unsplash.com/photo-1555041469-a586c61ea9bc?w=600&amp;h=400&amp;fit=crop", priceRange: "$$$", isOpen: true, lat: 29.9660, lng: -95.7008 },</w:t>
-        <w:br/>
-        <w:br/>
-        <w:t xml:space="preserve">  // ── EDUCATION (5) ──</w:t>
-        <w:br/>
-        <w:t xml:space="preserve">  { id: "biz_edu_001", name: "Kumon Learning Center", category: "Education", rating: 4.5, reviewCount: 20, address: "123 Scholar Way", description: "Math and reading enrichment programs for children. Self-paced learning.", image: "https://images.unsplash.com/photo-1503676260728-1c00da094a0b?w=600&amp;h=400&amp;fit=crop", priceRange: "$$", isOpen: true, lat: 29.9692, lng: -95.6968 },</w:t>
-        <w:br/>
-        <w:t xml:space="preserve">  { id: "biz_edu_002", name: "Cypress Music Academy", category: "Education", rating: 4.8, reviewCount: 12, address: "456 Melody Lane", description: "Private music lessons. Piano, guitar, violin, drums, and voice.", image: "https://images.unsplash.com/photo-1514119412350-e174d90d585e?w=600&amp;h=400&amp;fit=crop", priceRange: "$$", isOpen: true, lat: 29.9705, lng: -95.6950 },</w:t>
-        <w:br/>
-        <w:t xml:space="preserve">  { id: "biz_edu_003", name: "Code Kids Academy", category: "Education", rating: 4.7, reviewCount: 9, address: "789 Binary Blvd", description: "Coding classes for kids ages 6-18. Robotics, game design, and web development.", image: "https://images.unsplash.com/photo-1531482615713-2afd69097998?w=600&amp;h=400&amp;fit=crop", priceRange: "$$", isOpen: true, lat: 29.9672, lng: -95.6995 },</w:t>
-        <w:br/>
-        <w:t xml:space="preserve">  { id: "biz_edu_004", name: "Little Explorers Montessori", category: "Education", rating: 4.9, reviewCount: 16, address: "234 Discovery Drive", description: "Montessori preschool and kindergarten. Nurturing environment for ages 2-6.", image: "https://images.unsplash.com/photo-1587654780291-39c9404d7dd0?w=600&amp;h=400&amp;fit=crop", priceRange: "$$$", isOpen: true, lat: 29.9718, lng: -95.6932 },</w:t>
-        <w:br/>
-        <w:t xml:space="preserve">  { id: "biz_edu_005", name: "Cypress Tutoring Center", category: "Education", rating: 4.6, reviewCount: 14, address: "567 Study Street", description: "SAT/ACT prep, subject tutoring, and college counseling.", image: "https://images.unsplash.com/photo-1522202176988-66273c2fd55f?w=600&amp;h=400&amp;fit=crop", priceRange: "$$", isOpen: true, lat: 29.9660, lng: -95.7012 },</w:t>
-        <w:br/>
-        <w:t>];</w:t>
-        <w:br/>
-        <w:br/>
-        <w:t>export const reviews: Review[] = [</w:t>
-        <w:br/>
-        <w:t xml:space="preserve">  { id: "r1", author: "Sarah Johnson", initials: "SJ", date: "Oct 12, 2024", text: "The sunset views at the Boardwalk are unmatched. Ambriza is our go-to spot!", rating: 5 },</w:t>
-        <w:br/>
-        <w:t xml:space="preserve">  { id: "r2", author: "Mike Davis", initials: "MD", date: "Nov 05, 2024", text: "Love the live music on weekends. Great atmosphere for the whole family.", rating: 5 },</w:t>
-        <w:br/>
-        <w:t xml:space="preserve">  { id: "r3", author: "Emily Chen", initials: "EC", date: "Dec 01, 2024", text: "Club Pilates changed my life. The instructors are amazing.", rating: 5 },</w:t>
-        <w:br/>
-        <w:t xml:space="preserve">  { id: "r4", author: "David Wilson", initials: "DW", date: "Jan 15, 2025", text: "Great place to hang out, though parking can get busy on Friday nights.", rating: 4 },</w:t>
-        <w:br/>
-        <w:t xml:space="preserve">  { id: "r5", author: "Jessica Taylor", initials: "JT", date: "Feb 02, 2025", text: "Crumbl Cookies is dangerous! In the best way possible.", rating: 5 },</w:t>
-        <w:br/>
-        <w:t xml:space="preserve">  { id: "r6", author: "Robert Martinez", initials: "RM", date: "Feb 20, 2025", text: "The green space is perfect for kids to run around while we eat.", rating: 5 },</w:t>
-        <w:br/>
-        <w:t xml:space="preserve">  { id: "r7", author: "Amanda White", initials: "AW", date: "Mar 10, 2025", text: "Union Kitchen never disappoints. The patio seating is lovely.", rating: 5 },</w:t>
-        <w:br/>
-        <w:t xml:space="preserve">  { id: "r8", author: "Chris Brown", initials: "CB", date: "Mar 25, 2025", text: "Nice variety of shops and restaurants. Always clean and safe.", rating: 4 },</w:t>
-        <w:br/>
-        <w:t xml:space="preserve">  { id: "r9", author: "Jennifer Lee", initials: "JL", date: "Apr 05, 2025", text: "The holiday events here are spectacular. My kids love it.", rating: 5 },</w:t>
-        <w:br/>
-        <w:t xml:space="preserve">  { id: "r10", author: "Sarah M.", initials: "SM", date: "Jan 10, 2025", text: "Absolutely fantastic experience! Will definitely come back.", rating: 5 },</w:t>
-        <w:br/>
-        <w:t xml:space="preserve">  { id: "r11", author: "John D.", initials: "JD", date: "Feb 15, 2025", text: "Great service and friendly staff. Highly recommended!", rating: 5 },</w:t>
-        <w:br/>
-        <w:t xml:space="preserve">  { id: "r12", author: "Emily R.", initials: "ER", date: "Mar 01, 2025", text: "The Cypress Community Food Bank does amazing work for our community.", rating: 5 },</w:t>
-        <w:br/>
-        <w:t>];</w:t>
-        <w:br/>
-        <w:br/>
-        <w:t>export const events: Event[] = [</w:t>
-        <w:br/>
-        <w:t xml:space="preserve">  { id: "evt_001", title: "Downtown Farmers Market", date: "2026-03-01", day: "1", month: "Mar", time: "8:00 AM", location: "Main Street Plaza" },</w:t>
-        <w:br/>
-        <w:t xml:space="preserve">  { id: "evt_002", title: "Small Business Networking Mixer", date: "2026-03-05", day: "5", month: "Mar", time: "6:00 PM", location: "Community Center" },</w:t>
-        <w:br/>
-        <w:t xml:space="preserve">  { id: "evt_003", title: "Outdoor Movie Night", date: "2026-03-08", day: "8", month: "Mar", time: "8:00 PM", location: "Central Park" },</w:t>
-        <w:br/>
-        <w:t xml:space="preserve">  { id: "evt_004", title: "Community Cleanup Day", date: "2026-03-12", day: "12", month: "Mar", time: "9:00 AM", location: "Various Locations" },</w:t>
-        <w:br/>
-        <w:t xml:space="preserve">  { id: "evt_005", title: "Local Art Walk", date: "2026-03-03", day: "3", month: "Mar", time: "5:00 PM", location: "Arts District" },</w:t>
-        <w:br/>
-        <w:t xml:space="preserve">  { id: "evt_006", title: "Food Truck Festival", date: "2026-03-19", day: "19", month: "Mar", time: "11:00 AM", location: "Riverside Park" },</w:t>
-        <w:br/>
-        <w:t xml:space="preserve">  { id: "evt_007", title: "Yoga in the Park", date: "2026-02-28", day: "28", month: "Feb", time: "7:00 AM", location: "Sunrise Park" },</w:t>
-        <w:br/>
-        <w:t xml:space="preserve">  { id: "evt_008", title: "Kids Coding Workshop", date: "2026-03-10", day: "10", month: "Mar", time: "10:00 AM", location: "Cypress Public Library" },</w:t>
-        <w:br/>
-        <w:t xml:space="preserve">  { id: "evt_009", title: "Live Music at the Bandshell", date: "2026-03-04", day: "4", month: "Mar", time: "7:00 PM", location: "Memorial Bandshell" },</w:t>
-        <w:br/>
-        <w:t xml:space="preserve">  { id: "evt_010", title: "Pet Adoption Event", date: "2026-03-06", day: "6", month: "Mar", time: "10:00 AM", location: "Happy Paws Pet Store" },</w:t>
-        <w:br/>
-        <w:t xml:space="preserve">  { id: "evt_011", title: "Community Blood Drive", date: "2026-03-02", day: "2", month: "Mar", time: "9:00 AM", location: "Cypress Community Center" },</w:t>
-        <w:br/>
-        <w:t xml:space="preserve">  { id: "evt_012", title: "Neighborhood Watch Meeting", date: "2026-03-07", day: "7", month: "Mar", time: "7:00 PM", location: "Cypress Town Hall" },</w:t>
-        <w:br/>
-        <w:t xml:space="preserve">  { id: "evt_013", title: "Library Story Time &amp; Crafts", date: "2026-03-01", day: "1", month: "Mar", time: "10:30 AM", location: "Cypress Public Library" },</w:t>
-        <w:br/>
-        <w:t>];</w:t>
-        <w:br/>
-        <w:br/>
-        <w:t>// Deals from FBLA (subset for display)</w:t>
-        <w:br/>
-        <w:t>export const deals: Deal[] = [</w:t>
-        <w:br/>
-        <w:t xml:space="preserve">  { id: "deal_001", business_id: "biz_rest_001", title: "20% Off Breakfast", description: "Start your day right! Get 20% off any breakfast item before 10 AM.", discount: "20%", valid_until: "2026-04-01" },</w:t>
-        <w:br/>
-        <w:t xml:space="preserve">  { id: "deal_002", business_id: "biz_fit_001", title: "First Month Free", description: "New members get their first month absolutely free. No commitment required.", discount: "100% First Month", valid_until: "2026-04-15" },</w:t>
-        <w:br/>
-        <w:t xml:space="preserve">  { id: "deal_003", business_id: "biz_ret_001", title: "Buy 2 Get 1 Free", description: "Purchase any two books and get a third book of equal or lesser value free.", discount: "Buy 2 Get 1", valid_until: "2026-03-15" },</w:t>
-        <w:br/>
-        <w:t xml:space="preserve">  { id: "deal_004", business_id: "biz_auto_001", title: "$25 Off Oil Change", description: "Full synthetic oil change at a discounted price. Includes filter and inspection.", discount: "$25 Off", valid_until: "2026-04-30" },</w:t>
-        <w:br/>
-        <w:t xml:space="preserve">  { id: "deal_005", business_id: "biz_beauty_001", title: "15% Off First Visit", description: "New clients receive 15% off any service. Haircuts, color, or spa treatments.", discount: "15%", valid_until: "2026-05-01" },</w:t>
-        <w:br/>
-        <w:t xml:space="preserve">  { id: "deal_006", business_id: "biz_rest_002", title: "Family Deal - $5 Off", description: "Get $5 off any large pizza with purchase of a family meal deal.", discount: "$5 Off", valid_until: "2026-03-20" },</w:t>
-        <w:br/>
-        <w:t xml:space="preserve">  { id: "deal_007", business_id: "biz_np_001", title: "Volunteer &amp; Donate", description: "Support the Cypress Community Food Bank. Volunteer hours and donations welcome.", discount: "Community", valid_until: "2026-12-31" },</w:t>
-        <w:br/>
-        <w:t xml:space="preserve">  { id: "deal_008", business_id: "biz_np_004", title: "Adoption Fee Waived", description: "Adoption fees waived this month for cats and dogs. Find your new best friend!", discount: "Free Adoption", valid_until: "2026-03-31" },</w:t>
-        <w:br/>
-        <w:t>];</w:t>
         <w:br/>
       </w:r>
     </w:p>
@@ -5388,547 +4343,6 @@
         <w:t xml:space="preserve">  return { reviews, addReview };</w:t>
         <w:br/>
         <w:t>};</w:t>
-        <w:br/>
-      </w:r>
-    </w:p>
-    <w:p/>
-    <w:p>
-      <w:pPr>
-        <w:pStyle w:val="Heading2"/>
-      </w:pPr>
-      <w:r>
-        <w:t>src/index.css</w:t>
-      </w:r>
-    </w:p>
-    <w:p>
-      <w:pPr>
-        <w:spacing w:before="120" w:after="120"/>
-        <w:ind w:left="288"/>
-      </w:pPr>
-      <w:r>
-        <w:rPr>
-          <w:rFonts w:ascii="Consolas" w:hAnsi="Consolas"/>
-          <w:sz w:val="18"/>
-        </w:rPr>
-        <w:t>@import url('https://fonts.googleapis.com/css2?family=Space+Grotesk:wght@300;400;500;600;700&amp;family=Playfair+Display:wght@400;500;600;700;800&amp;display=swap');</w:t>
-        <w:br/>
-        <w:br/>
-        <w:t>@tailwind base;</w:t>
-        <w:br/>
-        <w:t>@tailwind components;</w:t>
-        <w:br/>
-        <w:t>@tailwind utilities;</w:t>
-        <w:br/>
-        <w:br/>
-        <w:t>@layer base {</w:t>
-        <w:br/>
-        <w:t xml:space="preserve">  :root {</w:t>
-        <w:br/>
-        <w:t xml:space="preserve">    --background: 40 30% 96%;</w:t>
-        <w:br/>
-        <w:t xml:space="preserve">    --foreground: 220 40% 13%;</w:t>
-        <w:br/>
-        <w:br/>
-        <w:t xml:space="preserve">    --card: 0 0% 100%;</w:t>
-        <w:br/>
-        <w:t xml:space="preserve">    --card-foreground: 220 40% 13%;</w:t>
-        <w:br/>
-        <w:br/>
-        <w:t xml:space="preserve">    --popover: 0 0% 100%;</w:t>
-        <w:br/>
-        <w:t xml:space="preserve">    --popover-foreground: 220 40% 13%;</w:t>
-        <w:br/>
-        <w:br/>
-        <w:t xml:space="preserve">    --primary: 220 45% 20%;</w:t>
-        <w:br/>
-        <w:t xml:space="preserve">    --primary-foreground: 40 30% 96%;</w:t>
-        <w:br/>
-        <w:br/>
-        <w:t xml:space="preserve">    --secondary: 40 55% 55%;</w:t>
-        <w:br/>
-        <w:t xml:space="preserve">    --secondary-foreground: 220 40% 13%;</w:t>
-        <w:br/>
-        <w:br/>
-        <w:t xml:space="preserve">    --muted: 40 20% 90%;</w:t>
-        <w:br/>
-        <w:t xml:space="preserve">    --muted-foreground: 220 15% 45%;</w:t>
-        <w:br/>
-        <w:br/>
-        <w:t xml:space="preserve">    --accent: 40 55% 55%;</w:t>
-        <w:br/>
-        <w:t xml:space="preserve">    --accent-foreground: 220 40% 13%;</w:t>
-        <w:br/>
-        <w:br/>
-        <w:t xml:space="preserve">    --destructive: 0 84.2% 60.2%;</w:t>
-        <w:br/>
-        <w:t xml:space="preserve">    --destructive-foreground: 0 0% 100%;</w:t>
-        <w:br/>
-        <w:br/>
-        <w:t xml:space="preserve">    --border: 220 20% 88%;</w:t>
-        <w:br/>
-        <w:t xml:space="preserve">    --input: 220 20% 88%;</w:t>
-        <w:br/>
-        <w:t xml:space="preserve">    --ring: 220 45% 20%;</w:t>
-        <w:br/>
-        <w:br/>
-        <w:t xml:space="preserve">    --radius: 0.75rem;</w:t>
-        <w:br/>
-        <w:br/>
-        <w:t xml:space="preserve">    --navy: 220 45% 20%;</w:t>
-        <w:br/>
-        <w:t xml:space="preserve">    --navy-light: 220 35% 30%;</w:t>
-        <w:br/>
-        <w:t xml:space="preserve">    --gold: 40 55% 55%;</w:t>
-        <w:br/>
-        <w:t xml:space="preserve">    --gold-light: 40 60% 70%;</w:t>
-        <w:br/>
-        <w:t xml:space="preserve">    --cream: 40 30% 96%;</w:t>
-        <w:br/>
-        <w:t xml:space="preserve">    --cream-dark: 40 20% 90%;</w:t>
-        <w:br/>
-        <w:br/>
-        <w:t xml:space="preserve">    --font-display: 'Playfair Display', serif;</w:t>
-        <w:br/>
-        <w:t xml:space="preserve">    --font-body: 'Space Grotesk', sans-serif;</w:t>
-        <w:br/>
-        <w:br/>
-        <w:t xml:space="preserve">    --sidebar-background: 220 45% 15%;</w:t>
-        <w:br/>
-        <w:t xml:space="preserve">    --sidebar-foreground: 40 30% 96%;</w:t>
-        <w:br/>
-        <w:t xml:space="preserve">    --sidebar-primary: 40 55% 55%;</w:t>
-        <w:br/>
-        <w:t xml:space="preserve">    --sidebar-primary-foreground: 220 40% 13%;</w:t>
-        <w:br/>
-        <w:t xml:space="preserve">    --sidebar-accent: 220 35% 25%;</w:t>
-        <w:br/>
-        <w:t xml:space="preserve">    --sidebar-accent-foreground: 40 30% 96%;</w:t>
-        <w:br/>
-        <w:t xml:space="preserve">    --sidebar-border: 220 35% 25%;</w:t>
-        <w:br/>
-        <w:t xml:space="preserve">    --sidebar-ring: 40 55% 55%;</w:t>
-        <w:br/>
-        <w:t xml:space="preserve">  }</w:t>
-        <w:br/>
-        <w:t>}</w:t>
-        <w:br/>
-        <w:br/>
-        <w:t>@layer base {</w:t>
-        <w:br/>
-        <w:t xml:space="preserve">  * {</w:t>
-        <w:br/>
-        <w:t xml:space="preserve">    @apply border-border;</w:t>
-        <w:br/>
-        <w:t xml:space="preserve">  }</w:t>
-        <w:br/>
-        <w:br/>
-        <w:t xml:space="preserve">  body {</w:t>
-        <w:br/>
-        <w:t xml:space="preserve">    @apply bg-background text-foreground;</w:t>
-        <w:br/>
-        <w:t xml:space="preserve">    font-family: var(--font-body);</w:t>
-        <w:br/>
-        <w:t xml:space="preserve">  }</w:t>
-        <w:br/>
-        <w:br/>
-        <w:t xml:space="preserve">  h1, h2, h3 {</w:t>
-        <w:br/>
-        <w:t xml:space="preserve">    font-family: var(--font-display);</w:t>
-        <w:br/>
-        <w:t xml:space="preserve">  }</w:t>
-        <w:br/>
-        <w:br/>
-        <w:t xml:space="preserve">  h4, h5, h6 {</w:t>
-        <w:br/>
-        <w:t xml:space="preserve">    font-family: var(--font-body);</w:t>
-        <w:br/>
-        <w:t xml:space="preserve">  }</w:t>
-        <w:br/>
-        <w:t>}</w:t>
-        <w:br/>
-        <w:br/>
-        <w:t>@layer utilities {</w:t>
-        <w:br/>
-        <w:t xml:space="preserve">  .text-gold-glow {</w:t>
-        <w:br/>
-        <w:t xml:space="preserve">    text-shadow: 0 0 20px hsl(var(--gold) / 0.4);</w:t>
-        <w:br/>
-        <w:t xml:space="preserve">  }</w:t>
-        <w:br/>
-        <w:br/>
-        <w:t xml:space="preserve">  .gradient-gold {</w:t>
-        <w:br/>
-        <w:t xml:space="preserve">    @apply bg-clip-text text-transparent;</w:t>
-        <w:br/>
-        <w:t xml:space="preserve">    background-image: linear-gradient(135deg, hsl(var(--gold)), hsl(var(--gold-light)));</w:t>
-        <w:br/>
-        <w:t xml:space="preserve">  }</w:t>
-        <w:br/>
-        <w:br/>
-        <w:t xml:space="preserve">  .bg-navy-gradient {</w:t>
-        <w:br/>
-        <w:t xml:space="preserve">    background: linear-gradient(135deg, hsl(var(--navy)), hsl(var(--navy-light)));</w:t>
-        <w:br/>
-        <w:t xml:space="preserve">  }</w:t>
-        <w:br/>
-        <w:br/>
-        <w:t xml:space="preserve">  .bg-hero-overlay {</w:t>
-        <w:br/>
-        <w:t xml:space="preserve">    background: linear-gradient(to bottom, hsl(var(--navy) / 0.7), hsl(var(--navy) / 0.85));</w:t>
-        <w:br/>
-        <w:t xml:space="preserve">  }</w:t>
-        <w:br/>
-        <w:br/>
-        <w:t xml:space="preserve">  .card-hover {</w:t>
-        <w:br/>
-        <w:t xml:space="preserve">    @apply transition-all duration-300;</w:t>
-        <w:br/>
-        <w:t xml:space="preserve">  }</w:t>
-        <w:br/>
-        <w:br/>
-        <w:t xml:space="preserve">  .card-hover:hover {</w:t>
-        <w:br/>
-        <w:t xml:space="preserve">    transform: translateY(-4px);</w:t>
-        <w:br/>
-        <w:t xml:space="preserve">    box-shadow: 0 12px 40px -8px hsl(var(--navy) / 0.15);</w:t>
-        <w:br/>
-        <w:t xml:space="preserve">  }</w:t>
-        <w:br/>
-        <w:br/>
-        <w:t xml:space="preserve">  /* Glassmorphism */</w:t>
-        <w:br/>
-        <w:t xml:space="preserve">  .glass {</w:t>
-        <w:br/>
-        <w:t xml:space="preserve">    background: hsl(var(--card) / 0.55);</w:t>
-        <w:br/>
-        <w:t xml:space="preserve">    backdrop-filter: blur(20px) saturate(1.4);</w:t>
-        <w:br/>
-        <w:t xml:space="preserve">    -webkit-backdrop-filter: blur(20px) saturate(1.4);</w:t>
-        <w:br/>
-        <w:t xml:space="preserve">    border: 1px solid hsl(var(--border) / 0.4);</w:t>
-        <w:br/>
-        <w:t xml:space="preserve">  }</w:t>
-        <w:br/>
-        <w:br/>
-        <w:t xml:space="preserve">  .glass-dark {</w:t>
-        <w:br/>
-        <w:t xml:space="preserve">    background: hsl(var(--navy) / 0.6);</w:t>
-        <w:br/>
-        <w:t xml:space="preserve">    backdrop-filter: blur(24px) saturate(1.5);</w:t>
-        <w:br/>
-        <w:t xml:space="preserve">    -webkit-backdrop-filter: blur(24px) saturate(1.5);</w:t>
-        <w:br/>
-        <w:t xml:space="preserve">    border: 1px solid hsl(var(--navy-light) / 0.3);</w:t>
-        <w:br/>
-        <w:t xml:space="preserve">  }</w:t>
-        <w:br/>
-        <w:br/>
-        <w:t xml:space="preserve">  .glass-gold {</w:t>
-        <w:br/>
-        <w:t xml:space="preserve">    background: hsl(var(--gold) / 0.08);</w:t>
-        <w:br/>
-        <w:t xml:space="preserve">    backdrop-filter: blur(16px);</w:t>
-        <w:br/>
-        <w:t xml:space="preserve">    -webkit-backdrop-filter: blur(16px);</w:t>
-        <w:br/>
-        <w:t xml:space="preserve">    border: 1px solid hsl(var(--gold) / 0.15);</w:t>
-        <w:br/>
-        <w:t xml:space="preserve">  }</w:t>
-        <w:br/>
-        <w:br/>
-        <w:t xml:space="preserve">  /* Glow effects */</w:t>
-        <w:br/>
-        <w:t xml:space="preserve">  .glow-gold {</w:t>
-        <w:br/>
-        <w:t xml:space="preserve">    box-shadow: 0 0 30px -5px hsl(var(--gold) / 0.25), 0 0 60px -15px hsl(var(--gold) / 0.1);</w:t>
-        <w:br/>
-        <w:t xml:space="preserve">  }</w:t>
-        <w:br/>
-        <w:br/>
-        <w:t xml:space="preserve">  .glow-navy {</w:t>
-        <w:br/>
-        <w:t xml:space="preserve">    box-shadow: 0 0 40px -5px hsl(var(--navy) / 0.3);</w:t>
-        <w:br/>
-        <w:t xml:space="preserve">  }</w:t>
-        <w:br/>
-        <w:br/>
-        <w:t xml:space="preserve">  /* Depth layers */</w:t>
-        <w:br/>
-        <w:t xml:space="preserve">  .depth-shadow {</w:t>
-        <w:br/>
-        <w:t xml:space="preserve">    box-shadow:</w:t>
-        <w:br/>
-        <w:t xml:space="preserve">      0 1px 2px hsl(var(--navy) / 0.04),</w:t>
-        <w:br/>
-        <w:t xml:space="preserve">      0 4px 8px hsl(var(--navy) / 0.06),</w:t>
-        <w:br/>
-        <w:t xml:space="preserve">      0 16px 32px hsl(var(--navy) / 0.08),</w:t>
-        <w:br/>
-        <w:t xml:space="preserve">      0 32px 64px hsl(var(--navy) / 0.04);</w:t>
-        <w:br/>
-        <w:t xml:space="preserve">  }</w:t>
-        <w:br/>
-        <w:br/>
-        <w:t xml:space="preserve">  .depth-shadow-lg {</w:t>
-        <w:br/>
-        <w:t xml:space="preserve">    box-shadow:</w:t>
-        <w:br/>
-        <w:t xml:space="preserve">      0 2px 4px hsl(var(--navy) / 0.04),</w:t>
-        <w:br/>
-        <w:t xml:space="preserve">      0 8px 16px hsl(var(--navy) / 0.06),</w:t>
-        <w:br/>
-        <w:t xml:space="preserve">      0 24px 48px hsl(var(--navy) / 0.1),</w:t>
-        <w:br/>
-        <w:t xml:space="preserve">      0 48px 96px hsl(var(--navy) / 0.06);</w:t>
-        <w:br/>
-        <w:t xml:space="preserve">  }</w:t>
-        <w:br/>
-        <w:t>}</w:t>
-        <w:br/>
-      </w:r>
-    </w:p>
-    <w:p/>
-    <w:p>
-      <w:pPr>
-        <w:pStyle w:val="Heading2"/>
-      </w:pPr>
-      <w:r>
-        <w:t>◆  src/lib/authApi.ts</w:t>
-      </w:r>
-    </w:p>
-    <w:p>
-      <w:pPr>
-        <w:spacing w:before="160" w:after="120"/>
-        <w:ind w:left="216" w:right="216"/>
-      </w:pPr>
-      <w:r>
-        <w:rPr>
-          <w:rFonts w:ascii="Calibri" w:hAnsi="Calibri"/>
-          <w:b/>
-          <w:sz w:val="20"/>
-          <w:highlight w:val="darkGray"/>
-        </w:rPr>
-        <w:t>FBLA Rubric: Data storage with security — localStorage-based auth; Appropriate data storage; Logical program sequence.</w:t>
-      </w:r>
-    </w:p>
-    <w:p>
-      <w:pPr>
-        <w:spacing w:before="120" w:after="120"/>
-        <w:ind w:left="288"/>
-      </w:pPr>
-      <w:r>
-        <w:rPr>
-          <w:rFonts w:ascii="Consolas" w:hAnsi="Consolas"/>
-          <w:sz w:val="18"/>
-        </w:rPr>
-        <w:t>/**</w:t>
-        <w:br/>
-        <w:t xml:space="preserve"> * Local auth API - Uses localStorage (no backend required)</w:t>
-        <w:br/>
-        <w:t xml:space="preserve"> * Works offline. Demo: demo@locallink.com / demo123 or any email/password</w:t>
-        <w:br/>
-        <w:t xml:space="preserve"> */</w:t>
-        <w:br/>
-        <w:br/>
-        <w:t>export interface User {</w:t>
-        <w:br/>
-        <w:t xml:space="preserve">  id: string;</w:t>
-        <w:br/>
-        <w:t xml:space="preserve">  email: string;</w:t>
-        <w:br/>
-        <w:t xml:space="preserve">  name?: string;</w:t>
-        <w:br/>
-        <w:t xml:space="preserve">  role?: 'user' | 'admin' | 'business_owner';</w:t>
-        <w:br/>
-        <w:t>}</w:t>
-        <w:br/>
-        <w:br/>
-        <w:t>const STORAGE_KEY = 'locallink_user';</w:t>
-        <w:br/>
-        <w:t>const DEMO_EMAIL = 'demo@locallink.com';</w:t>
-        <w:br/>
-        <w:t>const DEMO_PASSWORD = 'demo123';</w:t>
-        <w:br/>
-        <w:br/>
-        <w:t>const generateId = () =&gt;</w:t>
-        <w:br/>
-        <w:t xml:space="preserve">  `user_${Date.now().toString(36)}_${Math.random().toString(36).substring(2, 10)}`;</w:t>
-        <w:br/>
-        <w:br/>
-        <w:t>export const authApi = {</w:t>
-        <w:br/>
-        <w:t xml:space="preserve">  async signUp(email: string, password: string, name?: string) {</w:t>
-        <w:br/>
-        <w:t xml:space="preserve">    const user: User = {</w:t>
-        <w:br/>
-        <w:t xml:space="preserve">      id: generateId(),</w:t>
-        <w:br/>
-        <w:t xml:space="preserve">      email,</w:t>
-        <w:br/>
-        <w:t xml:space="preserve">      name: name || email.split('@')[0],</w:t>
-        <w:br/>
-        <w:t xml:space="preserve">      role: 'user',</w:t>
-        <w:br/>
-        <w:t xml:space="preserve">    };</w:t>
-        <w:br/>
-        <w:t xml:space="preserve">    localStorage.setItem(STORAGE_KEY, JSON.stringify(user));</w:t>
-        <w:br/>
-        <w:t xml:space="preserve">    return { user };</w:t>
-        <w:br/>
-        <w:t xml:space="preserve">  },</w:t>
-        <w:br/>
-        <w:br/>
-        <w:t xml:space="preserve">  async signIn(email: string, password: string) {</w:t>
-        <w:br/>
-        <w:t xml:space="preserve">    const stored = localStorage.getItem(STORAGE_KEY);</w:t>
-        <w:br/>
-        <w:t xml:space="preserve">    if (stored) {</w:t>
-        <w:br/>
-        <w:t xml:space="preserve">      const user = JSON.parse(stored);</w:t>
-        <w:br/>
-        <w:t xml:space="preserve">      if (user.email === email) {</w:t>
-        <w:br/>
-        <w:t xml:space="preserve">        return { user };</w:t>
-        <w:br/>
-        <w:t xml:space="preserve">      }</w:t>
-        <w:br/>
-        <w:t xml:space="preserve">    }</w:t>
-        <w:br/>
-        <w:t xml:space="preserve">    // Demo login</w:t>
-        <w:br/>
-        <w:t xml:space="preserve">    if (email === DEMO_EMAIL &amp;&amp; password === DEMO_PASSWORD) {</w:t>
-        <w:br/>
-        <w:t xml:space="preserve">      const user: User = {</w:t>
-        <w:br/>
-        <w:t xml:space="preserve">        id: generateId(),</w:t>
-        <w:br/>
-        <w:t xml:space="preserve">        email: DEMO_EMAIL,</w:t>
-        <w:br/>
-        <w:t xml:space="preserve">        name: 'Demo User',</w:t>
-        <w:br/>
-        <w:t xml:space="preserve">        role: 'user',</w:t>
-        <w:br/>
-        <w:t xml:space="preserve">      };</w:t>
-        <w:br/>
-        <w:t xml:space="preserve">      localStorage.setItem(STORAGE_KEY, JSON.stringify(user));</w:t>
-        <w:br/>
-        <w:t xml:space="preserve">      return { user };</w:t>
-        <w:br/>
-        <w:t xml:space="preserve">    }</w:t>
-        <w:br/>
-        <w:t xml:space="preserve">    // New user - create on first login (local mode)</w:t>
-        <w:br/>
-        <w:t xml:space="preserve">    const user: User = {</w:t>
-        <w:br/>
-        <w:t xml:space="preserve">      id: generateId(),</w:t>
-        <w:br/>
-        <w:t xml:space="preserve">      email,</w:t>
-        <w:br/>
-        <w:t xml:space="preserve">      name: email.split('@')[0],</w:t>
-        <w:br/>
-        <w:t xml:space="preserve">      role: 'user',</w:t>
-        <w:br/>
-        <w:t xml:space="preserve">    };</w:t>
-        <w:br/>
-        <w:t xml:space="preserve">    localStorage.setItem(STORAGE_KEY, JSON.stringify(user));</w:t>
-        <w:br/>
-        <w:t xml:space="preserve">    return { user };</w:t>
-        <w:br/>
-        <w:t xml:space="preserve">  },</w:t>
-        <w:br/>
-        <w:br/>
-        <w:t xml:space="preserve">  async signOut() {</w:t>
-        <w:br/>
-        <w:t xml:space="preserve">    localStorage.removeItem(STORAGE_KEY);</w:t>
-        <w:br/>
-        <w:t xml:space="preserve">    return { message: 'Signed out successfully' };</w:t>
-        <w:br/>
-        <w:t xml:space="preserve">  },</w:t>
-        <w:br/>
-        <w:br/>
-        <w:t xml:space="preserve">  async getUser(): Promise&lt;{ user: User | null }&gt; {</w:t>
-        <w:br/>
-        <w:t xml:space="preserve">    const stored = localStorage.getItem(STORAGE_KEY);</w:t>
-        <w:br/>
-        <w:t xml:space="preserve">    if (!stored) return { user: null };</w:t>
-        <w:br/>
-        <w:t xml:space="preserve">    try {</w:t>
-        <w:br/>
-        <w:t xml:space="preserve">      const user = JSON.parse(stored);</w:t>
-        <w:br/>
-        <w:t xml:space="preserve">      return { user };</w:t>
-        <w:br/>
-        <w:t xml:space="preserve">    } catch {</w:t>
-        <w:br/>
-        <w:t xml:space="preserve">      return { user: null };</w:t>
-        <w:br/>
-        <w:t xml:space="preserve">    }</w:t>
-        <w:br/>
-        <w:t xml:space="preserve">  },</w:t>
-        <w:br/>
-        <w:t>};</w:t>
-        <w:br/>
-      </w:r>
-    </w:p>
-    <w:p/>
-    <w:p>
-      <w:pPr>
-        <w:pStyle w:val="Heading2"/>
-      </w:pPr>
-      <w:r>
-        <w:t>src/lib/utils.ts</w:t>
-      </w:r>
-    </w:p>
-    <w:p>
-      <w:pPr>
-        <w:spacing w:before="120" w:after="120"/>
-        <w:ind w:left="288"/>
-      </w:pPr>
-      <w:r>
-        <w:rPr>
-          <w:rFonts w:ascii="Consolas" w:hAnsi="Consolas"/>
-          <w:sz w:val="18"/>
-        </w:rPr>
-        <w:t>import { clsx, type ClassValue } from "clsx";</w:t>
-        <w:br/>
-        <w:t>import { twMerge } from "tailwind-merge";</w:t>
-        <w:br/>
-        <w:br/>
-        <w:t>export function cn(...inputs: ClassValue[]) {</w:t>
-        <w:br/>
-        <w:t xml:space="preserve">  return twMerge(clsx(inputs));</w:t>
-        <w:br/>
-        <w:t>}</w:t>
-        <w:br/>
-      </w:r>
-    </w:p>
-    <w:p/>
-    <w:p>
-      <w:pPr>
-        <w:pStyle w:val="Heading2"/>
-      </w:pPr>
-      <w:r>
-        <w:t>src/main.tsx</w:t>
-      </w:r>
-    </w:p>
-    <w:p>
-      <w:pPr>
-        <w:spacing w:before="120" w:after="120"/>
-        <w:ind w:left="288"/>
-      </w:pPr>
-      <w:r>
-        <w:rPr>
-          <w:rFonts w:ascii="Consolas" w:hAnsi="Consolas"/>
-          <w:sz w:val="18"/>
-        </w:rPr>
-        <w:t>import { createRoot } from "react-dom/client";</w:t>
-        <w:br/>
-        <w:t>import App from "./App.tsx";</w:t>
-        <w:br/>
-        <w:t>import "./index.css";</w:t>
-        <w:br/>
-        <w:br/>
-        <w:t>createRoot(document.getElementById("root")!).render(&lt;App /&gt;);</w:t>
         <w:br/>
       </w:r>
     </w:p>

</xml_diff>